<commit_message>
Updates to the readme file 18th Oct
</commit_message>
<xml_diff>
--- a/readme.docx
+++ b/readme.docx
@@ -237,6 +237,27 @@
       </w:r>
     </w:p>
     <w:p>
+      <w:pPr>
+        <w:ind w:left="360"/>
+      </w:pPr>
+      <w:r>
+        <w:t xml:space="preserve">e.g. </w:t>
+      </w:r>
+      <w:r>
+        <w:rPr>
+          <w:shd w:val="clear" w:color="auto" w:fill="D9D9D9" w:themeFill="background1" w:themeFillShade="D9"/>
+        </w:rPr>
+        <w:t>D:\Github\vaibhav\Scripts</w:t>
+      </w:r>
+      <w:r>
+        <w:rPr>
+          <w:highlight w:val="lightGray"/>
+          <w:shd w:val="clear" w:color="auto" w:fill="D9D9D9" w:themeFill="background1" w:themeFillShade="D9"/>
+        </w:rPr>
+        <w:t>\activate</w:t>
+      </w:r>
+    </w:p>
+    <w:p>
       <w:r>
         <w:pict w14:anchorId="4317E931">
           <v:rect id="_x0000_i1025" style="width:0;height:1.5pt" o:hralign="center" o:hrstd="t" o:hrnoshade="t" o:hr="t" fillcolor="#616161" stroked="f"/>
@@ -367,7 +388,16 @@
         <w:spacing w:line="276" w:lineRule="auto"/>
       </w:pPr>
       <w:r>
-        <w:t>Press Ctrl + Shift + P to open the Command Palette.</w:t>
+        <w:t xml:space="preserve">Press </w:t>
+      </w:r>
+      <w:r>
+        <w:rPr>
+          <w:highlight w:val="yellow"/>
+        </w:rPr>
+        <w:t>Ctrl + Shift + P</w:t>
+      </w:r>
+      <w:r>
+        <w:t xml:space="preserve"> to open the Command Palette.</w:t>
       </w:r>
     </w:p>
     <w:p>
@@ -410,6 +440,7 @@
         <w:rPr>
           <w:b/>
           <w:bCs/>
+          <w:highlight w:val="yellow"/>
         </w:rPr>
         <w:t xml:space="preserve">activated your </w:t>
       </w:r>
@@ -418,6 +449,7 @@
         <w:rPr>
           <w:b/>
           <w:bCs/>
+          <w:highlight w:val="yellow"/>
         </w:rPr>
         <w:t>venv</w:t>
       </w:r>
@@ -426,16 +458,21 @@
         <w:rPr>
           <w:b/>
           <w:bCs/>
+          <w:highlight w:val="yellow"/>
         </w:rPr>
         <w:t xml:space="preserve"> in the terminal</w:t>
       </w:r>
       <w:r>
+        <w:rPr>
+          <w:highlight w:val="yellow"/>
+        </w:rPr>
         <w:t> but </w:t>
       </w:r>
       <w:r>
         <w:rPr>
           <w:b/>
           <w:bCs/>
+          <w:highlight w:val="yellow"/>
         </w:rPr>
         <w:t>did not select it as the Python interpreter in VS Code</w:t>
       </w:r>
@@ -481,6 +518,7 @@
           <w:b/>
           <w:bCs/>
         </w:rPr>
+        <w:lastRenderedPageBreak/>
         <w:t xml:space="preserve">Installed packages in your </w:t>
       </w:r>
       <w:proofErr w:type="spellStart"/>
@@ -515,7 +553,6 @@
           <w:b/>
           <w:bCs/>
         </w:rPr>
-        <w:lastRenderedPageBreak/>
         <w:t>Linting, IntelliSense, and code navigation</w:t>
       </w:r>
       <w:r>
@@ -575,6 +612,63 @@
       <w:proofErr w:type="spellEnd"/>
       <w:r>
         <w:t xml:space="preserve"> as the Python interpreter in VS Code to ensure your code runs with the correct environment and dependencies.</w:t>
+      </w:r>
+    </w:p>
+    <w:p>
+      <w:r>
+        <w:t>Clear the command prompt:</w:t>
+      </w:r>
+    </w:p>
+    <w:p>
+      <w:r>
+        <w:rPr>
+          <w:noProof/>
+        </w:rPr>
+        <w:drawing>
+          <wp:inline distT="0" distB="0" distL="0" distR="0" wp14:anchorId="731C0824" wp14:editId="0CA58CF5">
+            <wp:extent cx="6529754" cy="1259840"/>
+            <wp:effectExtent l="0" t="0" r="4445" b="0"/>
+            <wp:docPr id="1434465232" name="Picture 1"/>
+            <wp:cNvGraphicFramePr>
+              <a:graphicFrameLocks xmlns:a="http://schemas.openxmlformats.org/drawingml/2006/main" noChangeAspect="1"/>
+            </wp:cNvGraphicFramePr>
+            <a:graphic xmlns:a="http://schemas.openxmlformats.org/drawingml/2006/main">
+              <a:graphicData uri="http://schemas.openxmlformats.org/drawingml/2006/picture">
+                <pic:pic xmlns:pic="http://schemas.openxmlformats.org/drawingml/2006/picture">
+                  <pic:nvPicPr>
+                    <pic:cNvPr id="0" name="Picture 3"/>
+                    <pic:cNvPicPr>
+                      <a:picLocks noChangeAspect="1" noChangeArrowheads="1"/>
+                    </pic:cNvPicPr>
+                  </pic:nvPicPr>
+                  <pic:blipFill>
+                    <a:blip r:embed="rId5">
+                      <a:extLst>
+                        <a:ext uri="{28A0092B-C50C-407E-A947-70E740481C1C}">
+                          <a14:useLocalDpi xmlns:a14="http://schemas.microsoft.com/office/drawing/2010/main" val="0"/>
+                        </a:ext>
+                      </a:extLst>
+                    </a:blip>
+                    <a:srcRect/>
+                    <a:stretch>
+                      <a:fillRect/>
+                    </a:stretch>
+                  </pic:blipFill>
+                  <pic:spPr bwMode="auto">
+                    <a:xfrm>
+                      <a:off x="0" y="0"/>
+                      <a:ext cx="6542792" cy="1262356"/>
+                    </a:xfrm>
+                    <a:prstGeom prst="rect">
+                      <a:avLst/>
+                    </a:prstGeom>
+                    <a:noFill/>
+                  </pic:spPr>
+                </pic:pic>
+              </a:graphicData>
+            </a:graphic>
+          </wp:inline>
+        </w:drawing>
       </w:r>
     </w:p>
     <w:p>
@@ -625,6 +719,9 @@
     </w:p>
     <w:p>
       <w:r>
+        <w:rPr>
+          <w:noProof/>
+        </w:rPr>
         <w:drawing>
           <wp:inline distT="0" distB="0" distL="0" distR="0" wp14:anchorId="52022B21" wp14:editId="75058133">
             <wp:extent cx="4572638" cy="1200318"/>
@@ -641,7 +738,7 @@
                     <pic:cNvPicPr/>
                   </pic:nvPicPr>
                   <pic:blipFill>
-                    <a:blip r:embed="rId5">
+                    <a:blip r:embed="rId6">
                       <a:extLst>
                         <a:ext uri="{28A0092B-C50C-407E-A947-70E740481C1C}">
                           <a14:useLocalDpi xmlns:a14="http://schemas.microsoft.com/office/drawing/2010/main" val="0"/>
@@ -670,7 +767,13 @@
     </w:p>
     <w:p>
       <w:r>
-        <w:t>This section is how to commit to GitHub from VScode.</w:t>
+        <w:t xml:space="preserve">This section is </w:t>
+      </w:r>
+      <w:r>
+        <w:t xml:space="preserve">about </w:t>
+      </w:r>
+      <w:r>
+        <w:t>how to commit to GitHub from VScode.</w:t>
       </w:r>
     </w:p>
     <w:p>
@@ -848,6 +951,7 @@
         <w:ind w:left="360"/>
       </w:pPr>
       <w:r>
+        <w:lastRenderedPageBreak/>
         <w:t>If the values are shown correctly, Git has taken your username and email properly.</w:t>
       </w:r>
     </w:p>
@@ -925,7 +1029,6 @@
         <w:ind w:left="360" w:right="-188"/>
       </w:pPr>
       <w:r>
-        <w:lastRenderedPageBreak/>
         <w:t>Go to your repository on GitHub and copy the URL (it looks</w:t>
       </w:r>
       <w:r>
@@ -934,7 +1037,7 @@
       <w:r>
         <w:t>like </w:t>
       </w:r>
-      <w:hyperlink r:id="rId6" w:history="1">
+      <w:hyperlink r:id="rId7" w:history="1">
         <w:r>
           <w:rPr>
             <w:rStyle w:val="Hyperlink"/>
@@ -979,6 +1082,7 @@
           <w:numId w:val="8"/>
         </w:numPr>
         <w:spacing w:line="360" w:lineRule="auto"/>
+        <w:ind w:left="426"/>
         <w:jc w:val="both"/>
       </w:pPr>
       <w:r>
@@ -999,6 +1103,7 @@
         <w:pStyle w:val="ListParagraph"/>
         <w:shd w:val="clear" w:color="auto" w:fill="F2F2F2" w:themeFill="background1" w:themeFillShade="F2"/>
         <w:spacing w:after="240" w:line="360" w:lineRule="auto"/>
+        <w:ind w:left="426"/>
         <w:jc w:val="both"/>
       </w:pPr>
       <w:r>
@@ -1007,6 +1112,9 @@
     </w:p>
     <w:p>
       <w:r>
+        <w:rPr>
+          <w:highlight w:val="yellow"/>
+        </w:rPr>
         <w:t>Git does not push individual files; it pushes commits (which can include changes to one or more files) to a branch.</w:t>
       </w:r>
     </w:p>
@@ -1385,6 +1493,10 @@
         <w:ind w:left="360"/>
       </w:pPr>
       <w:r>
+        <w:rPr>
+          <w:noProof/>
+        </w:rPr>
+        <w:lastRenderedPageBreak/>
         <w:drawing>
           <wp:inline distT="0" distB="0" distL="0" distR="0" wp14:anchorId="11432AA3" wp14:editId="2B4F0634">
             <wp:extent cx="4595750" cy="3336589"/>
@@ -1401,7 +1513,7 @@
                     <pic:cNvPicPr/>
                   </pic:nvPicPr>
                   <pic:blipFill>
-                    <a:blip r:embed="rId7">
+                    <a:blip r:embed="rId8">
                       <a:extLst>
                         <a:ext uri="{28A0092B-C50C-407E-A947-70E740481C1C}">
                           <a14:useLocalDpi xmlns:a14="http://schemas.microsoft.com/office/drawing/2010/main" val="0"/>
@@ -1430,6 +1542,34 @@
     </w:p>
     <w:p>
       <w:pPr>
+        <w:spacing w:line="360" w:lineRule="auto"/>
+      </w:pPr>
+      <w:r>
+        <w:rPr>
+          <w:b/>
+          <w:bCs/>
+          <w:u w:val="single"/>
+        </w:rPr>
+        <w:t>Important:</w:t>
+      </w:r>
+      <w:r>
+        <w:t xml:space="preserve"> </w:t>
+      </w:r>
+      <w:r>
+        <w:rPr>
+          <w:highlight w:val="yellow"/>
+        </w:rPr>
+        <w:t>Y</w:t>
+      </w:r>
+      <w:r>
+        <w:rPr>
+          <w:highlight w:val="yellow"/>
+        </w:rPr>
+        <w:t>ou cannot directly edit the online GitHub repository (the "remote repo"). Instead, you work with a local copy of the repository on your laptop, make changes locally, and then push those changes to the desired branch on GitHub. Git is designed this way to ensure version control and collaboration safety.</w:t>
+      </w:r>
+    </w:p>
+    <w:p>
+      <w:pPr>
         <w:pStyle w:val="ListParagraph"/>
         <w:numPr>
           <w:ilvl w:val="0"/>
@@ -1438,7 +1578,6 @@
         <w:spacing w:line="360" w:lineRule="auto"/>
       </w:pPr>
       <w:r>
-        <w:lastRenderedPageBreak/>
         <w:t>Pulling code from a repo.</w:t>
       </w:r>
     </w:p>
@@ -1447,10 +1586,13 @@
         <w:spacing w:line="360" w:lineRule="auto"/>
       </w:pPr>
       <w:r>
+        <w:rPr>
+          <w:noProof/>
+        </w:rPr>
         <w:drawing>
-          <wp:inline distT="0" distB="0" distL="0" distR="0" wp14:anchorId="2CC8B39C" wp14:editId="2A9F2CE8">
-            <wp:extent cx="4905911" cy="5553075"/>
-            <wp:effectExtent l="0" t="0" r="9525" b="0"/>
+          <wp:inline distT="0" distB="0" distL="0" distR="0" wp14:anchorId="2CC8B39C" wp14:editId="1C10D27A">
+            <wp:extent cx="4905375" cy="2907323"/>
+            <wp:effectExtent l="0" t="0" r="0" b="7620"/>
             <wp:docPr id="275131296" name="Picture 1"/>
             <wp:cNvGraphicFramePr>
               <a:graphicFrameLocks xmlns:a="http://schemas.openxmlformats.org/drawingml/2006/main" noChangeAspect="1"/>
@@ -1462,8 +1604,279 @@
                     <pic:cNvPr id="275131296" name=""/>
                     <pic:cNvPicPr/>
                   </pic:nvPicPr>
+                  <pic:blipFill rotWithShape="1">
+                    <a:blip r:embed="rId9">
+                      <a:extLst>
+                        <a:ext uri="{28A0092B-C50C-407E-A947-70E740481C1C}">
+                          <a14:useLocalDpi xmlns:a14="http://schemas.microsoft.com/office/drawing/2010/main" val="0"/>
+                        </a:ext>
+                      </a:extLst>
+                    </a:blip>
+                    <a:srcRect b="47639"/>
+                    <a:stretch>
+                      <a:fillRect/>
+                    </a:stretch>
+                  </pic:blipFill>
+                  <pic:spPr bwMode="auto">
+                    <a:xfrm>
+                      <a:off x="0" y="0"/>
+                      <a:ext cx="4907132" cy="2908364"/>
+                    </a:xfrm>
+                    <a:prstGeom prst="rect">
+                      <a:avLst/>
+                    </a:prstGeom>
+                    <a:ln>
+                      <a:noFill/>
+                    </a:ln>
+                    <a:extLst>
+                      <a:ext uri="{53640926-AAD7-44D8-BBD7-CCE9431645EC}">
+                        <a14:shadowObscured xmlns:a14="http://schemas.microsoft.com/office/drawing/2010/main"/>
+                      </a:ext>
+                    </a:extLst>
+                  </pic:spPr>
+                </pic:pic>
+              </a:graphicData>
+            </a:graphic>
+          </wp:inline>
+        </w:drawing>
+      </w:r>
+    </w:p>
+    <w:p>
+      <w:pPr>
+        <w:spacing w:line="360" w:lineRule="auto"/>
+      </w:pPr>
+    </w:p>
+    <w:p>
+      <w:pPr>
+        <w:spacing w:line="360" w:lineRule="auto"/>
+      </w:pPr>
+      <w:r>
+        <w:rPr>
+          <w:noProof/>
+        </w:rPr>
+        <w:lastRenderedPageBreak/>
+        <w:drawing>
+          <wp:inline distT="0" distB="0" distL="0" distR="0" wp14:anchorId="77D94DCE" wp14:editId="59816365">
+            <wp:extent cx="4905375" cy="2750653"/>
+            <wp:effectExtent l="0" t="0" r="0" b="0"/>
+            <wp:docPr id="1521374749" name="Picture 1"/>
+            <wp:cNvGraphicFramePr>
+              <a:graphicFrameLocks xmlns:a="http://schemas.openxmlformats.org/drawingml/2006/main" noChangeAspect="1"/>
+            </wp:cNvGraphicFramePr>
+            <a:graphic xmlns:a="http://schemas.openxmlformats.org/drawingml/2006/main">
+              <a:graphicData uri="http://schemas.openxmlformats.org/drawingml/2006/picture">
+                <pic:pic xmlns:pic="http://schemas.openxmlformats.org/drawingml/2006/picture">
+                  <pic:nvPicPr>
+                    <pic:cNvPr id="275131296" name=""/>
+                    <pic:cNvPicPr/>
+                  </pic:nvPicPr>
+                  <pic:blipFill rotWithShape="1">
+                    <a:blip r:embed="rId9">
+                      <a:extLst>
+                        <a:ext uri="{28A0092B-C50C-407E-A947-70E740481C1C}">
+                          <a14:useLocalDpi xmlns:a14="http://schemas.microsoft.com/office/drawing/2010/main" val="0"/>
+                        </a:ext>
+                      </a:extLst>
+                    </a:blip>
+                    <a:srcRect t="50461"/>
+                    <a:stretch>
+                      <a:fillRect/>
+                    </a:stretch>
+                  </pic:blipFill>
+                  <pic:spPr bwMode="auto">
+                    <a:xfrm>
+                      <a:off x="0" y="0"/>
+                      <a:ext cx="4907132" cy="2751638"/>
+                    </a:xfrm>
+                    <a:prstGeom prst="rect">
+                      <a:avLst/>
+                    </a:prstGeom>
+                    <a:ln>
+                      <a:noFill/>
+                    </a:ln>
+                    <a:extLst>
+                      <a:ext uri="{53640926-AAD7-44D8-BBD7-CCE9431645EC}">
+                        <a14:shadowObscured xmlns:a14="http://schemas.microsoft.com/office/drawing/2010/main"/>
+                      </a:ext>
+                    </a:extLst>
+                  </pic:spPr>
+                </pic:pic>
+              </a:graphicData>
+            </a:graphic>
+          </wp:inline>
+        </w:drawing>
+      </w:r>
+    </w:p>
+    <w:p>
+      <w:pPr>
+        <w:spacing w:line="360" w:lineRule="auto"/>
+      </w:pPr>
+      <w:r>
+        <w:t>When you use git clone, you can specify the folder location by adding a path at the end of the command.</w:t>
+      </w:r>
+    </w:p>
+    <w:p>
+      <w:pPr>
+        <w:spacing w:line="276" w:lineRule="auto"/>
+      </w:pPr>
+      <w:r>
+        <w:rPr>
+          <w:b/>
+          <w:bCs/>
+        </w:rPr>
+        <w:t>Syntax:</w:t>
+      </w:r>
+    </w:p>
+    <w:p>
+      <w:pPr>
+        <w:shd w:val="clear" w:color="auto" w:fill="F2F2F2" w:themeFill="background1" w:themeFillShade="F2"/>
+        <w:spacing w:line="276" w:lineRule="auto"/>
+      </w:pPr>
+      <w:r>
+        <w:t>git clone &lt;repo-</w:t>
+      </w:r>
+      <w:proofErr w:type="spellStart"/>
+      <w:r>
+        <w:t>url</w:t>
+      </w:r>
+      <w:proofErr w:type="spellEnd"/>
+      <w:r>
+        <w:t>&gt; &lt;folder-path&gt;</w:t>
+      </w:r>
+    </w:p>
+    <w:p>
+      <w:pPr>
+        <w:spacing w:line="276" w:lineRule="auto"/>
+      </w:pPr>
+      <w:r>
+        <w:rPr>
+          <w:b/>
+          <w:bCs/>
+        </w:rPr>
+        <w:t>Example:</w:t>
+      </w:r>
+      <w:r>
+        <w:br/>
+        <w:t>To clone into D:\Github\myproject:</w:t>
+      </w:r>
+    </w:p>
+    <w:p>
+      <w:pPr>
+        <w:shd w:val="clear" w:color="auto" w:fill="F2F2F2" w:themeFill="background1" w:themeFillShade="F2"/>
+        <w:spacing w:line="276" w:lineRule="auto"/>
+      </w:pPr>
+      <w:r>
+        <w:t>git clone https://github.com/yourusername/yourrepo.git D:\Github\myproject</w:t>
+      </w:r>
+    </w:p>
+    <w:p>
+      <w:pPr>
+        <w:shd w:val="clear" w:color="auto" w:fill="F2F2F2" w:themeFill="background1" w:themeFillShade="F2"/>
+        <w:spacing w:line="276" w:lineRule="auto"/>
+      </w:pPr>
+      <w:r>
+        <w:t xml:space="preserve">e.g. </w:t>
+      </w:r>
+      <w:r>
+        <w:t xml:space="preserve">git clone </w:t>
+      </w:r>
+      <w:r>
+        <w:t>https://github.com/vkabdwal/vscode_vk</w:t>
+      </w:r>
+      <w:r>
+        <w:t>.git D:\Github\</w:t>
+      </w:r>
+      <w:r>
+        <w:t>myproject_local</w:t>
+      </w:r>
+    </w:p>
+    <w:p>
+      <w:pPr>
+        <w:spacing w:line="276" w:lineRule="auto"/>
+      </w:pPr>
+      <w:r>
+        <w:drawing>
+          <wp:inline distT="0" distB="0" distL="0" distR="0" wp14:anchorId="7785A771" wp14:editId="5D7594C8">
+            <wp:extent cx="6153404" cy="2291862"/>
+            <wp:effectExtent l="0" t="0" r="0" b="0"/>
+            <wp:docPr id="1319432048" name="Picture 1"/>
+            <wp:cNvGraphicFramePr>
+              <a:graphicFrameLocks xmlns:a="http://schemas.openxmlformats.org/drawingml/2006/main" noChangeAspect="1"/>
+            </wp:cNvGraphicFramePr>
+            <a:graphic xmlns:a="http://schemas.openxmlformats.org/drawingml/2006/main">
+              <a:graphicData uri="http://schemas.openxmlformats.org/drawingml/2006/picture">
+                <pic:pic xmlns:pic="http://schemas.openxmlformats.org/drawingml/2006/picture">
+                  <pic:nvPicPr>
+                    <pic:cNvPr id="1319432048" name=""/>
+                    <pic:cNvPicPr/>
+                  </pic:nvPicPr>
+                  <pic:blipFill rotWithShape="1">
+                    <a:blip r:embed="rId10">
+                      <a:extLst>
+                        <a:ext uri="{28A0092B-C50C-407E-A947-70E740481C1C}">
+                          <a14:useLocalDpi xmlns:a14="http://schemas.microsoft.com/office/drawing/2010/main" val="0"/>
+                        </a:ext>
+                      </a:extLst>
+                    </a:blip>
+                    <a:srcRect b="58534"/>
+                    <a:stretch>
+                      <a:fillRect/>
+                    </a:stretch>
+                  </pic:blipFill>
+                  <pic:spPr bwMode="auto">
+                    <a:xfrm>
+                      <a:off x="0" y="0"/>
+                      <a:ext cx="6161328" cy="2294813"/>
+                    </a:xfrm>
+                    <a:prstGeom prst="rect">
+                      <a:avLst/>
+                    </a:prstGeom>
+                    <a:ln>
+                      <a:noFill/>
+                    </a:ln>
+                    <a:extLst>
+                      <a:ext uri="{53640926-AAD7-44D8-BBD7-CCE9431645EC}">
+                        <a14:shadowObscured xmlns:a14="http://schemas.microsoft.com/office/drawing/2010/main"/>
+                      </a:ext>
+                    </a:extLst>
+                  </pic:spPr>
+                </pic:pic>
+              </a:graphicData>
+            </a:graphic>
+          </wp:inline>
+        </w:drawing>
+      </w:r>
+    </w:p>
+    <w:p>
+      <w:pPr>
+        <w:spacing w:line="276" w:lineRule="auto"/>
+      </w:pPr>
+    </w:p>
+    <w:p>
+      <w:pPr>
+        <w:spacing w:line="276" w:lineRule="auto"/>
+      </w:pPr>
+      <w:r>
+        <w:tab/>
+      </w:r>
+      <w:r>
+        <w:drawing>
+          <wp:inline distT="0" distB="0" distL="0" distR="0" wp14:anchorId="5C87288B" wp14:editId="711AFD69">
+            <wp:extent cx="2620010" cy="1060938"/>
+            <wp:effectExtent l="0" t="0" r="0" b="6350"/>
+            <wp:docPr id="964522564" name="Picture 1"/>
+            <wp:cNvGraphicFramePr>
+              <a:graphicFrameLocks xmlns:a="http://schemas.openxmlformats.org/drawingml/2006/main" noChangeAspect="1"/>
+            </wp:cNvGraphicFramePr>
+            <a:graphic xmlns:a="http://schemas.openxmlformats.org/drawingml/2006/main">
+              <a:graphicData uri="http://schemas.openxmlformats.org/drawingml/2006/picture">
+                <pic:pic xmlns:pic="http://schemas.openxmlformats.org/drawingml/2006/picture">
+                  <pic:nvPicPr>
+                    <pic:cNvPr id="964522564" name=""/>
+                    <pic:cNvPicPr/>
+                  </pic:nvPicPr>
                   <pic:blipFill>
-                    <a:blip r:embed="rId8">
+                    <a:blip r:embed="rId11">
                       <a:extLst>
                         <a:ext uri="{28A0092B-C50C-407E-A947-70E740481C1C}">
                           <a14:useLocalDpi xmlns:a14="http://schemas.microsoft.com/office/drawing/2010/main" val="0"/>
@@ -1477,7 +1890,7 @@
                   <pic:spPr>
                     <a:xfrm>
                       <a:off x="0" y="0"/>
-                      <a:ext cx="4907132" cy="5554457"/>
+                      <a:ext cx="2623343" cy="1062288"/>
                     </a:xfrm>
                     <a:prstGeom prst="rect">
                       <a:avLst/>
@@ -1492,10 +1905,118 @@
     </w:p>
     <w:p>
       <w:pPr>
+        <w:spacing w:line="276" w:lineRule="auto"/>
+      </w:pPr>
+      <w:r>
+        <w:lastRenderedPageBreak/>
+        <w:drawing>
+          <wp:inline distT="0" distB="0" distL="0" distR="0" wp14:anchorId="6C088930" wp14:editId="1E408019">
+            <wp:extent cx="6153404" cy="3194148"/>
+            <wp:effectExtent l="0" t="0" r="0" b="6350"/>
+            <wp:docPr id="1239716772" name="Picture 1"/>
+            <wp:cNvGraphicFramePr>
+              <a:graphicFrameLocks xmlns:a="http://schemas.openxmlformats.org/drawingml/2006/main" noChangeAspect="1"/>
+            </wp:cNvGraphicFramePr>
+            <a:graphic xmlns:a="http://schemas.openxmlformats.org/drawingml/2006/main">
+              <a:graphicData uri="http://schemas.openxmlformats.org/drawingml/2006/picture">
+                <pic:pic xmlns:pic="http://schemas.openxmlformats.org/drawingml/2006/picture">
+                  <pic:nvPicPr>
+                    <pic:cNvPr id="1319432048" name=""/>
+                    <pic:cNvPicPr/>
+                  </pic:nvPicPr>
+                  <pic:blipFill rotWithShape="1">
+                    <a:blip r:embed="rId10">
+                      <a:extLst>
+                        <a:ext uri="{28A0092B-C50C-407E-A947-70E740481C1C}">
+                          <a14:useLocalDpi xmlns:a14="http://schemas.microsoft.com/office/drawing/2010/main" val="0"/>
+                        </a:ext>
+                      </a:extLst>
+                    </a:blip>
+                    <a:srcRect t="42209"/>
+                    <a:stretch>
+                      <a:fillRect/>
+                    </a:stretch>
+                  </pic:blipFill>
+                  <pic:spPr bwMode="auto">
+                    <a:xfrm>
+                      <a:off x="0" y="0"/>
+                      <a:ext cx="6161328" cy="3198261"/>
+                    </a:xfrm>
+                    <a:prstGeom prst="rect">
+                      <a:avLst/>
+                    </a:prstGeom>
+                    <a:ln>
+                      <a:noFill/>
+                    </a:ln>
+                    <a:extLst>
+                      <a:ext uri="{53640926-AAD7-44D8-BBD7-CCE9431645EC}">
+                        <a14:shadowObscured xmlns:a14="http://schemas.microsoft.com/office/drawing/2010/main"/>
+                      </a:ext>
+                    </a:extLst>
+                  </pic:spPr>
+                </pic:pic>
+              </a:graphicData>
+            </a:graphic>
+          </wp:inline>
+        </w:drawing>
+      </w:r>
+    </w:p>
+    <w:p>
+      <w:pPr>
         <w:spacing w:line="360" w:lineRule="auto"/>
-      </w:pPr>
-      <w:r>
-        <w:t>When you use git clone, you can specify the folder location by adding a path at the end of the command.</w:t>
+        <w:ind w:left="360"/>
+      </w:pPr>
+      <w:r>
+        <w:drawing>
+          <wp:inline distT="0" distB="0" distL="0" distR="0" wp14:anchorId="0667F556" wp14:editId="2508DE68">
+            <wp:extent cx="6388016" cy="3622431"/>
+            <wp:effectExtent l="0" t="0" r="0" b="0"/>
+            <wp:docPr id="1548314688" name="Picture 1"/>
+            <wp:cNvGraphicFramePr>
+              <a:graphicFrameLocks xmlns:a="http://schemas.openxmlformats.org/drawingml/2006/main" noChangeAspect="1"/>
+            </wp:cNvGraphicFramePr>
+            <a:graphic xmlns:a="http://schemas.openxmlformats.org/drawingml/2006/main">
+              <a:graphicData uri="http://schemas.openxmlformats.org/drawingml/2006/picture">
+                <pic:pic xmlns:pic="http://schemas.openxmlformats.org/drawingml/2006/picture">
+                  <pic:nvPicPr>
+                    <pic:cNvPr id="1132100179" name=""/>
+                    <pic:cNvPicPr/>
+                  </pic:nvPicPr>
+                  <pic:blipFill rotWithShape="1">
+                    <a:blip r:embed="rId12">
+                      <a:extLst>
+                        <a:ext uri="{28A0092B-C50C-407E-A947-70E740481C1C}">
+                          <a14:useLocalDpi xmlns:a14="http://schemas.microsoft.com/office/drawing/2010/main" val="0"/>
+                        </a:ext>
+                      </a:extLst>
+                    </a:blip>
+                    <a:srcRect t="-1" b="43597"/>
+                    <a:stretch>
+                      <a:fillRect/>
+                    </a:stretch>
+                  </pic:blipFill>
+                  <pic:spPr bwMode="auto">
+                    <a:xfrm>
+                      <a:off x="0" y="0"/>
+                      <a:ext cx="6414801" cy="3637620"/>
+                    </a:xfrm>
+                    <a:prstGeom prst="rect">
+                      <a:avLst/>
+                    </a:prstGeom>
+                    <a:ln>
+                      <a:noFill/>
+                    </a:ln>
+                    <a:extLst>
+                      <a:ext uri="{53640926-AAD7-44D8-BBD7-CCE9431645EC}">
+                        <a14:shadowObscured xmlns:a14="http://schemas.microsoft.com/office/drawing/2010/main"/>
+                      </a:ext>
+                    </a:extLst>
+                  </pic:spPr>
+                </pic:pic>
+              </a:graphicData>
+            </a:graphic>
+          </wp:inline>
+        </w:drawing>
       </w:r>
     </w:p>
     <w:p>
@@ -1503,11 +2024,156 @@
         <w:spacing w:line="276" w:lineRule="auto"/>
       </w:pPr>
       <w:r>
-        <w:rPr>
-          <w:b/>
-          <w:bCs/>
-        </w:rPr>
-        <w:t>Syntax:</w:t>
+        <w:lastRenderedPageBreak/>
+        <w:drawing>
+          <wp:inline distT="0" distB="0" distL="0" distR="0" wp14:anchorId="1B417A04" wp14:editId="214C2932">
+            <wp:extent cx="6487388" cy="2731477"/>
+            <wp:effectExtent l="0" t="0" r="8890" b="0"/>
+            <wp:docPr id="1132100179" name="Picture 1"/>
+            <wp:cNvGraphicFramePr>
+              <a:graphicFrameLocks xmlns:a="http://schemas.openxmlformats.org/drawingml/2006/main" noChangeAspect="1"/>
+            </wp:cNvGraphicFramePr>
+            <a:graphic xmlns:a="http://schemas.openxmlformats.org/drawingml/2006/main">
+              <a:graphicData uri="http://schemas.openxmlformats.org/drawingml/2006/picture">
+                <pic:pic xmlns:pic="http://schemas.openxmlformats.org/drawingml/2006/picture">
+                  <pic:nvPicPr>
+                    <pic:cNvPr id="1132100179" name=""/>
+                    <pic:cNvPicPr/>
+                  </pic:nvPicPr>
+                  <pic:blipFill rotWithShape="1">
+                    <a:blip r:embed="rId12">
+                      <a:extLst>
+                        <a:ext uri="{28A0092B-C50C-407E-A947-70E740481C1C}">
+                          <a14:useLocalDpi xmlns:a14="http://schemas.microsoft.com/office/drawing/2010/main" val="0"/>
+                        </a:ext>
+                      </a:extLst>
+                    </a:blip>
+                    <a:srcRect t="57401" b="1"/>
+                    <a:stretch>
+                      <a:fillRect/>
+                    </a:stretch>
+                  </pic:blipFill>
+                  <pic:spPr bwMode="auto">
+                    <a:xfrm>
+                      <a:off x="0" y="0"/>
+                      <a:ext cx="6505816" cy="2739236"/>
+                    </a:xfrm>
+                    <a:prstGeom prst="rect">
+                      <a:avLst/>
+                    </a:prstGeom>
+                    <a:ln>
+                      <a:noFill/>
+                    </a:ln>
+                    <a:extLst>
+                      <a:ext uri="{53640926-AAD7-44D8-BBD7-CCE9431645EC}">
+                        <a14:shadowObscured xmlns:a14="http://schemas.microsoft.com/office/drawing/2010/main"/>
+                      </a:ext>
+                    </a:extLst>
+                  </pic:spPr>
+                </pic:pic>
+              </a:graphicData>
+            </a:graphic>
+          </wp:inline>
+        </w:drawing>
+      </w:r>
+    </w:p>
+    <w:p>
+      <w:pPr>
+        <w:spacing w:line="276" w:lineRule="auto"/>
+      </w:pPr>
+      <w:r>
+        <w:drawing>
+          <wp:inline distT="0" distB="0" distL="0" distR="0" wp14:anchorId="06EF56D9" wp14:editId="30CD6239">
+            <wp:extent cx="6645910" cy="2684584"/>
+            <wp:effectExtent l="0" t="0" r="2540" b="1905"/>
+            <wp:docPr id="194448459" name="Picture 1"/>
+            <wp:cNvGraphicFramePr>
+              <a:graphicFrameLocks xmlns:a="http://schemas.openxmlformats.org/drawingml/2006/main" noChangeAspect="1"/>
+            </wp:cNvGraphicFramePr>
+            <a:graphic xmlns:a="http://schemas.openxmlformats.org/drawingml/2006/main">
+              <a:graphicData uri="http://schemas.openxmlformats.org/drawingml/2006/picture">
+                <pic:pic xmlns:pic="http://schemas.openxmlformats.org/drawingml/2006/picture">
+                  <pic:nvPicPr>
+                    <pic:cNvPr id="194448459" name=""/>
+                    <pic:cNvPicPr/>
+                  </pic:nvPicPr>
+                  <pic:blipFill>
+                    <a:blip r:embed="rId13">
+                      <a:extLst>
+                        <a:ext uri="{28A0092B-C50C-407E-A947-70E740481C1C}">
+                          <a14:useLocalDpi xmlns:a14="http://schemas.microsoft.com/office/drawing/2010/main" val="0"/>
+                        </a:ext>
+                      </a:extLst>
+                    </a:blip>
+                    <a:stretch>
+                      <a:fillRect/>
+                    </a:stretch>
+                  </pic:blipFill>
+                  <pic:spPr>
+                    <a:xfrm>
+                      <a:off x="0" y="0"/>
+                      <a:ext cx="6649324" cy="2685963"/>
+                    </a:xfrm>
+                    <a:prstGeom prst="rect">
+                      <a:avLst/>
+                    </a:prstGeom>
+                  </pic:spPr>
+                </pic:pic>
+              </a:graphicData>
+            </a:graphic>
+          </wp:inline>
+        </w:drawing>
+      </w:r>
+    </w:p>
+    <w:p>
+      <w:pPr>
+        <w:spacing w:line="276" w:lineRule="auto"/>
+      </w:pPr>
+      <w:r>
+        <w:rPr>
+          <w:noProof/>
+        </w:rPr>
+        <w:drawing>
+          <wp:inline distT="0" distB="0" distL="0" distR="0" wp14:anchorId="6421E108" wp14:editId="73113EBB">
+            <wp:extent cx="6645910" cy="3789045"/>
+            <wp:effectExtent l="0" t="0" r="2540" b="1905"/>
+            <wp:docPr id="590453475" name="Picture 1"/>
+            <wp:cNvGraphicFramePr>
+              <a:graphicFrameLocks xmlns:a="http://schemas.openxmlformats.org/drawingml/2006/main" noChangeAspect="1"/>
+            </wp:cNvGraphicFramePr>
+            <a:graphic xmlns:a="http://schemas.openxmlformats.org/drawingml/2006/main">
+              <a:graphicData uri="http://schemas.openxmlformats.org/drawingml/2006/picture">
+                <pic:pic xmlns:pic="http://schemas.openxmlformats.org/drawingml/2006/picture">
+                  <pic:nvPicPr>
+                    <pic:cNvPr id="590453475" name=""/>
+                    <pic:cNvPicPr/>
+                  </pic:nvPicPr>
+                  <pic:blipFill>
+                    <a:blip r:embed="rId14">
+                      <a:extLst>
+                        <a:ext uri="{28A0092B-C50C-407E-A947-70E740481C1C}">
+                          <a14:useLocalDpi xmlns:a14="http://schemas.microsoft.com/office/drawing/2010/main" val="0"/>
+                        </a:ext>
+                      </a:extLst>
+                    </a:blip>
+                    <a:stretch>
+                      <a:fillRect/>
+                    </a:stretch>
+                  </pic:blipFill>
+                  <pic:spPr>
+                    <a:xfrm>
+                      <a:off x="0" y="0"/>
+                      <a:ext cx="6645910" cy="3789045"/>
+                    </a:xfrm>
+                    <a:prstGeom prst="rect">
+                      <a:avLst/>
+                    </a:prstGeom>
+                  </pic:spPr>
+                </pic:pic>
+              </a:graphicData>
+            </a:graphic>
+          </wp:inline>
+        </w:drawing>
       </w:r>
     </w:p>
     <w:p>
@@ -1516,53 +2182,7 @@
         <w:spacing w:line="276" w:lineRule="auto"/>
       </w:pPr>
       <w:r>
-        <w:t>git clone &lt;repo-</w:t>
-      </w:r>
-      <w:proofErr w:type="spellStart"/>
-      <w:r>
-        <w:t>url</w:t>
-      </w:r>
-      <w:proofErr w:type="spellEnd"/>
-      <w:r>
-        <w:t>&gt; &lt;folder-path&gt;</w:t>
-      </w:r>
-    </w:p>
-    <w:p>
-      <w:pPr>
-        <w:spacing w:line="276" w:lineRule="auto"/>
-      </w:pPr>
-      <w:r>
-        <w:rPr>
-          <w:b/>
-          <w:bCs/>
-        </w:rPr>
-        <w:t>Example:</w:t>
-      </w:r>
-      <w:r>
-        <w:br/>
-        <w:t>To clone into D:\Github\myproject:</w:t>
-      </w:r>
-    </w:p>
-    <w:p>
-      <w:pPr>
-        <w:shd w:val="clear" w:color="auto" w:fill="F2F2F2" w:themeFill="background1" w:themeFillShade="F2"/>
-        <w:spacing w:line="276" w:lineRule="auto"/>
-      </w:pPr>
-      <w:r>
-        <w:t>git clone https://github.com/yourusername/yourrepo.git D:\Github\myproject</w:t>
-      </w:r>
-    </w:p>
-    <w:p>
-      <w:pPr>
-        <w:spacing w:line="276" w:lineRule="auto"/>
-      </w:pPr>
-    </w:p>
-    <w:p>
-      <w:pPr>
-        <w:shd w:val="clear" w:color="auto" w:fill="F2F2F2" w:themeFill="background1" w:themeFillShade="F2"/>
-        <w:spacing w:line="276" w:lineRule="auto"/>
-      </w:pPr>
-      <w:r>
+        <w:lastRenderedPageBreak/>
         <w:t xml:space="preserve">git pull origin </w:t>
       </w:r>
       <w:proofErr w:type="spellStart"/>
@@ -1625,6 +2245,15 @@
       <w:r>
         <w:br/>
         <w:t>It updates your local branch with any new commits from the same branch on GitHub.</w:t>
+      </w:r>
+      <w:r>
+        <w:t xml:space="preserve"> </w:t>
+      </w:r>
+      <w:r>
+        <w:t>Cloning copies the entire repository, including all branches, to your local machine</w:t>
+      </w:r>
+      <w:r>
+        <w:t xml:space="preserve">. </w:t>
       </w:r>
     </w:p>
     <w:p>

</xml_diff>

<commit_message>
New changes 2nd Oct
</commit_message>
<xml_diff>
--- a/readme.docx
+++ b/readme.docx
@@ -25,6 +25,16 @@
           <w:sz w:val="32"/>
           <w:szCs w:val="32"/>
         </w:rPr>
+        <w:t xml:space="preserve">Git </w:t>
+      </w:r>
+      <w:r>
+        <w:rPr>
+          <w:rFonts w:asciiTheme="minorHAnsi" w:hAnsiTheme="minorHAnsi" w:cstheme="minorHAnsi"/>
+          <w:b/>
+          <w:bCs/>
+          <w:sz w:val="32"/>
+          <w:szCs w:val="32"/>
+        </w:rPr>
         <w:t>Environment</w:t>
       </w:r>
     </w:p>
@@ -70,15 +80,7 @@
       </w:r>
       <w:r>
         <w:br/>
-        <w:t>Replace </w:t>
-      </w:r>
-      <w:proofErr w:type="spellStart"/>
-      <w:r>
-        <w:t>myenv</w:t>
-      </w:r>
-      <w:proofErr w:type="spellEnd"/>
-      <w:r>
-        <w:t> with your desired environment name.</w:t>
+        <w:t>Replace myenv with your desired environment name.</w:t>
       </w:r>
     </w:p>
     <w:p>
@@ -89,30 +91,8 @@
         <w:rPr>
           <w:highlight w:val="lightGray"/>
         </w:rPr>
-        <w:t>python -m </w:t>
-      </w:r>
-      <w:proofErr w:type="spellStart"/>
-      <w:r>
-        <w:rPr>
-          <w:highlight w:val="lightGray"/>
-        </w:rPr>
-        <w:t>venv</w:t>
-      </w:r>
-      <w:proofErr w:type="spellEnd"/>
-      <w:r>
-        <w:rPr>
-          <w:highlight w:val="lightGray"/>
-        </w:rPr>
-        <w:t> </w:t>
-      </w:r>
-      <w:proofErr w:type="spellStart"/>
-      <w:r>
-        <w:rPr>
-          <w:highlight w:val="lightGray"/>
-        </w:rPr>
-        <w:t>myenv</w:t>
-      </w:r>
-      <w:proofErr w:type="spellEnd"/>
+        <w:t>python -m venv myenv</w:t>
+      </w:r>
     </w:p>
     <w:p>
       <w:pPr>
@@ -125,21 +105,12 @@
         </w:rPr>
         <w:t>2. Activate the environment (</w:t>
       </w:r>
-      <w:proofErr w:type="spellStart"/>
-      <w:r>
-        <w:rPr>
-          <w:b/>
-          <w:bCs/>
-        </w:rPr>
-        <w:t>cmd</w:t>
-      </w:r>
-      <w:proofErr w:type="spellEnd"/>
-      <w:r>
-        <w:rPr>
-          <w:b/>
-          <w:bCs/>
-        </w:rPr>
-        <w:t xml:space="preserve"> set in VS code</w:t>
+      <w:r>
+        <w:rPr>
+          <w:b/>
+          <w:bCs/>
+        </w:rPr>
+        <w:t>cmd set in VS code</w:t>
       </w:r>
       <w:r>
         <w:rPr>
@@ -291,23 +262,7 @@
           <w:i/>
           <w:iCs/>
         </w:rPr>
-        <w:t xml:space="preserve">pip install pandas </w:t>
-      </w:r>
-      <w:proofErr w:type="spellStart"/>
-      <w:r>
-        <w:rPr>
-          <w:i/>
-          <w:iCs/>
-        </w:rPr>
-        <w:t>numpy</w:t>
-      </w:r>
-      <w:proofErr w:type="spellEnd"/>
-      <w:r>
-        <w:rPr>
-          <w:i/>
-          <w:iCs/>
-        </w:rPr>
-        <w:t xml:space="preserve"> matplotlib</w:t>
+        <w:t>pip install pandas numpy matplotlib</w:t>
       </w:r>
     </w:p>
     <w:p>
@@ -421,15 +376,7 @@
         <w:spacing w:line="276" w:lineRule="auto"/>
       </w:pPr>
       <w:r>
-        <w:t>Choose the interpreter from the "vaibhav" environment (it will typically be listed as something like Python &lt;version&gt; ('vaibhav') or the path to the environment’s Python executable, e.g.</w:t>
-      </w:r>
-      <w:proofErr w:type="gramStart"/>
-      <w:r>
-        <w:t>, .</w:t>
-      </w:r>
-      <w:proofErr w:type="gramEnd"/>
-      <w:r>
-        <w:t>/vaibhav/bin/python or .\vaibhav\Scripts\python.exe)</w:t>
+        <w:t>Choose the interpreter from the "vaibhav" environment (it will typically be listed as something like Python &lt;version&gt; ('vaibhav') or the path to the environment’s Python executable, e.g., ./vaibhav/bin/python or .\vaibhav\Scripts\python.exe)</w:t>
       </w:r>
     </w:p>
     <w:p>
@@ -442,25 +389,7 @@
           <w:bCs/>
           <w:highlight w:val="yellow"/>
         </w:rPr>
-        <w:t xml:space="preserve">activated your </w:t>
-      </w:r>
-      <w:proofErr w:type="spellStart"/>
-      <w:r>
-        <w:rPr>
-          <w:b/>
-          <w:bCs/>
-          <w:highlight w:val="yellow"/>
-        </w:rPr>
-        <w:t>venv</w:t>
-      </w:r>
-      <w:proofErr w:type="spellEnd"/>
-      <w:r>
-        <w:rPr>
-          <w:b/>
-          <w:bCs/>
-          <w:highlight w:val="yellow"/>
-        </w:rPr>
-        <w:t xml:space="preserve"> in the terminal</w:t>
+        <w:t>activated your venv in the terminal</w:t>
       </w:r>
       <w:r>
         <w:rPr>
@@ -495,15 +424,7 @@
         <w:t>VS Code might use a different Python interpreter</w:t>
       </w:r>
       <w:r>
-        <w:t xml:space="preserve"> (not your </w:t>
-      </w:r>
-      <w:proofErr w:type="spellStart"/>
-      <w:r>
-        <w:t>venv</w:t>
-      </w:r>
-      <w:proofErr w:type="spellEnd"/>
-      <w:r>
-        <w:t>) when running or debugging code.</w:t>
+        <w:t> (not your venv) when running or debugging code.</w:t>
       </w:r>
     </w:p>
     <w:p>
@@ -519,23 +440,7 @@
           <w:bCs/>
         </w:rPr>
         <w:lastRenderedPageBreak/>
-        <w:t xml:space="preserve">Installed packages in your </w:t>
-      </w:r>
-      <w:proofErr w:type="spellStart"/>
-      <w:r>
-        <w:rPr>
-          <w:b/>
-          <w:bCs/>
-        </w:rPr>
-        <w:t>venv</w:t>
-      </w:r>
-      <w:proofErr w:type="spellEnd"/>
-      <w:r>
-        <w:rPr>
-          <w:b/>
-          <w:bCs/>
-        </w:rPr>
-        <w:t xml:space="preserve"> may not be found</w:t>
+        <w:t>Installed packages in your venv may not be found</w:t>
       </w:r>
       <w:r>
         <w:t> by VS Code, leading to import errors.</w:t>
@@ -556,15 +461,7 @@
         <w:t>Linting, IntelliSense, and code navigation</w:t>
       </w:r>
       <w:r>
-        <w:t xml:space="preserve"> may not reflect your </w:t>
-      </w:r>
-      <w:proofErr w:type="spellStart"/>
-      <w:r>
-        <w:t>venv’s</w:t>
-      </w:r>
-      <w:proofErr w:type="spellEnd"/>
-      <w:r>
-        <w:t xml:space="preserve"> packages.</w:t>
+        <w:t> may not reflect your venv’s packages.</w:t>
       </w:r>
     </w:p>
     <w:p>
@@ -582,15 +479,7 @@
         <w:t>Terminal commands</w:t>
       </w:r>
       <w:r>
-        <w:t xml:space="preserve"> will use the </w:t>
-      </w:r>
-      <w:proofErr w:type="spellStart"/>
-      <w:r>
-        <w:t>venv</w:t>
-      </w:r>
-      <w:proofErr w:type="spellEnd"/>
-      <w:r>
-        <w:t>, but running scripts with the VS Code "Run" button may not.</w:t>
+        <w:t> will use the venv, but running scripts with the VS Code "Run" button may not.</w:t>
       </w:r>
     </w:p>
     <w:p>
@@ -603,15 +492,7 @@
       </w:r>
       <w:r>
         <w:br/>
-        <w:t xml:space="preserve">Always select your </w:t>
-      </w:r>
-      <w:proofErr w:type="spellStart"/>
-      <w:r>
-        <w:t>venv</w:t>
-      </w:r>
-      <w:proofErr w:type="spellEnd"/>
-      <w:r>
-        <w:t xml:space="preserve"> as the Python interpreter in VS Code to ensure your code runs with the correct environment and dependencies.</w:t>
+        <w:t>Always select your venv as the Python interpreter in VS Code to ensure your code runs with the correct environment and dependencies.</w:t>
       </w:r>
     </w:p>
     <w:p>
@@ -854,17 +735,7 @@
         <w:ind w:left="360"/>
       </w:pPr>
       <w:r>
-        <w:t xml:space="preserve">git config --global </w:t>
-      </w:r>
-      <w:proofErr w:type="spellStart"/>
-      <w:proofErr w:type="gramStart"/>
-      <w:r>
-        <w:t>user.email</w:t>
-      </w:r>
-      <w:proofErr w:type="spellEnd"/>
-      <w:proofErr w:type="gramEnd"/>
-      <w:r>
-        <w:t xml:space="preserve"> "vaibhav.kabdwal@gmail.com"</w:t>
+        <w:t>git config --global user.email "vaibhav.kabdwal@gmail.com"</w:t>
       </w:r>
     </w:p>
     <w:p>
@@ -893,15 +764,8 @@
         <w:ind w:left="360"/>
       </w:pPr>
       <w:r>
-        <w:t xml:space="preserve">git config --global </w:t>
-      </w:r>
-      <w:proofErr w:type="spellStart"/>
-      <w:proofErr w:type="gramStart"/>
-      <w:r>
-        <w:t>user.email</w:t>
-      </w:r>
-      <w:proofErr w:type="spellEnd"/>
-      <w:proofErr w:type="gramEnd"/>
+        <w:t>git config --global user.email</w:t>
+      </w:r>
     </w:p>
     <w:p>
       <w:pPr>
@@ -934,15 +798,8 @@
         <w:ind w:left="360"/>
       </w:pPr>
       <w:r>
-        <w:t xml:space="preserve">git config </w:t>
-      </w:r>
-      <w:proofErr w:type="spellStart"/>
-      <w:proofErr w:type="gramStart"/>
-      <w:r>
-        <w:t>user.email</w:t>
-      </w:r>
-      <w:proofErr w:type="spellEnd"/>
-      <w:proofErr w:type="gramEnd"/>
+        <w:t>git config user.email</w:t>
+      </w:r>
     </w:p>
     <w:p>
       <w:pPr>
@@ -1048,18 +905,12 @@
       <w:r>
         <w:t xml:space="preserve"> </w:t>
       </w:r>
-      <w:proofErr w:type="spellStart"/>
-      <w:r>
-        <w:t>yourusername</w:t>
-      </w:r>
-      <w:proofErr w:type="spellEnd"/>
-      <w:r>
-        <w:t>/</w:t>
+      <w:r>
+        <w:t>yourusername/</w:t>
       </w:r>
       <w:r>
         <w:t xml:space="preserve"> </w:t>
       </w:r>
-      <w:proofErr w:type="spellStart"/>
       <w:r>
         <w:t>your</w:t>
       </w:r>
@@ -1067,11 +918,7 @@
         <w:t>_</w:t>
       </w:r>
       <w:r>
-        <w:t>repo.git</w:t>
-      </w:r>
-      <w:proofErr w:type="spellEnd"/>
-      <w:r>
-        <w:t>).</w:t>
+        <w:t>repo.git).</w:t>
       </w:r>
     </w:p>
     <w:p>
@@ -1206,15 +1053,7 @@
         <w:ind w:left="1080"/>
       </w:pPr>
       <w:r>
-        <w:t xml:space="preserve">git add &lt;file&gt; (or git </w:t>
-      </w:r>
-      <w:proofErr w:type="gramStart"/>
-      <w:r>
-        <w:t>add .</w:t>
-      </w:r>
-      <w:proofErr w:type="gramEnd"/>
-      <w:r>
-        <w:t>) stages your changes.</w:t>
+        <w:t>git add &lt;file&gt; (or git add .) stages your changes.</w:t>
       </w:r>
     </w:p>
     <w:p>
@@ -1430,16 +1269,8 @@
         <w:rPr>
           <w:shd w:val="clear" w:color="auto" w:fill="F2F2F2" w:themeFill="background1" w:themeFillShade="F2"/>
         </w:rPr>
-        <w:t xml:space="preserve">git push origin </w:t>
-      </w:r>
-      <w:proofErr w:type="spellStart"/>
-      <w:r>
-        <w:rPr>
-          <w:shd w:val="clear" w:color="auto" w:fill="F2F2F2" w:themeFill="background1" w:themeFillShade="F2"/>
-        </w:rPr>
-        <w:t>branch_name</w:t>
-      </w:r>
-      <w:proofErr w:type="spellEnd"/>
+        <w:t>git push origin branch_name</w:t>
+      </w:r>
     </w:p>
     <w:p>
       <w:pPr>
@@ -1450,15 +1281,7 @@
         </w:rPr>
       </w:pPr>
       <w:r>
-        <w:t xml:space="preserve">For example, to push to </w:t>
-      </w:r>
-      <w:proofErr w:type="spellStart"/>
-      <w:r>
-        <w:t>revision_questions</w:t>
-      </w:r>
-      <w:proofErr w:type="spellEnd"/>
-      <w:r>
-        <w:t>:</w:t>
+        <w:t>For example, to push to revision_questions:</w:t>
       </w:r>
       <w:r>
         <w:t xml:space="preserve"> </w:t>
@@ -1467,16 +1290,8 @@
         <w:rPr>
           <w:shd w:val="clear" w:color="auto" w:fill="F2F2F2" w:themeFill="background1" w:themeFillShade="F2"/>
         </w:rPr>
-        <w:t xml:space="preserve">git push origin </w:t>
-      </w:r>
-      <w:proofErr w:type="spellStart"/>
-      <w:r>
-        <w:rPr>
-          <w:shd w:val="clear" w:color="auto" w:fill="F2F2F2" w:themeFill="background1" w:themeFillShade="F2"/>
-        </w:rPr>
-        <w:t>revision_questions</w:t>
-      </w:r>
-      <w:proofErr w:type="spellEnd"/>
+        <w:t>git push origin revision_questions</w:t>
+      </w:r>
     </w:p>
     <w:p>
       <w:pPr>
@@ -1733,15 +1548,7 @@
         <w:spacing w:line="276" w:lineRule="auto"/>
       </w:pPr>
       <w:r>
-        <w:t>git clone &lt;repo-</w:t>
-      </w:r>
-      <w:proofErr w:type="spellStart"/>
-      <w:r>
-        <w:t>url</w:t>
-      </w:r>
-      <w:proofErr w:type="spellEnd"/>
-      <w:r>
-        <w:t>&gt; &lt;folder-path&gt;</w:t>
+        <w:t>git clone &lt;repo-url&gt; &lt;folder-path&gt;</w:t>
       </w:r>
     </w:p>
     <w:p>
@@ -1795,6 +1602,9 @@
         <w:spacing w:line="276" w:lineRule="auto"/>
       </w:pPr>
       <w:r>
+        <w:rPr>
+          <w:noProof/>
+        </w:rPr>
         <w:drawing>
           <wp:inline distT="0" distB="0" distL="0" distR="0" wp14:anchorId="7785A771" wp14:editId="5D7594C8">
             <wp:extent cx="6153404" cy="2291862"/>
@@ -1860,6 +1670,9 @@
         <w:tab/>
       </w:r>
       <w:r>
+        <w:rPr>
+          <w:noProof/>
+        </w:rPr>
         <w:drawing>
           <wp:inline distT="0" distB="0" distL="0" distR="0" wp14:anchorId="5C87288B" wp14:editId="711AFD69">
             <wp:extent cx="2620010" cy="1060938"/>
@@ -1908,6 +1721,9 @@
         <w:spacing w:line="276" w:lineRule="auto"/>
       </w:pPr>
       <w:r>
+        <w:rPr>
+          <w:noProof/>
+        </w:rPr>
         <w:lastRenderedPageBreak/>
         <w:drawing>
           <wp:inline distT="0" distB="0" distL="0" distR="0" wp14:anchorId="6C088930" wp14:editId="1E408019">
@@ -1967,6 +1783,9 @@
         <w:ind w:left="360"/>
       </w:pPr>
       <w:r>
+        <w:rPr>
+          <w:noProof/>
+        </w:rPr>
         <w:drawing>
           <wp:inline distT="0" distB="0" distL="0" distR="0" wp14:anchorId="0667F556" wp14:editId="2508DE68">
             <wp:extent cx="6388016" cy="3622431"/>
@@ -2024,6 +1843,9 @@
         <w:spacing w:line="276" w:lineRule="auto"/>
       </w:pPr>
       <w:r>
+        <w:rPr>
+          <w:noProof/>
+        </w:rPr>
         <w:lastRenderedPageBreak/>
         <w:drawing>
           <wp:inline distT="0" distB="0" distL="0" distR="0" wp14:anchorId="1B417A04" wp14:editId="214C2932">
@@ -2082,6 +1904,9 @@
         <w:spacing w:line="276" w:lineRule="auto"/>
       </w:pPr>
       <w:r>
+        <w:rPr>
+          <w:noProof/>
+        </w:rPr>
         <w:drawing>
           <wp:inline distT="0" distB="0" distL="0" distR="0" wp14:anchorId="06EF56D9" wp14:editId="30CD6239">
             <wp:extent cx="6645910" cy="2684584"/>
@@ -2129,10 +1954,64 @@
       <w:pPr>
         <w:spacing w:line="276" w:lineRule="auto"/>
       </w:pPr>
+    </w:p>
+    <w:p>
+      <w:pPr>
+        <w:spacing w:line="276" w:lineRule="auto"/>
+      </w:pPr>
+      <w:r>
+        <w:drawing>
+          <wp:inline distT="0" distB="0" distL="0" distR="0" wp14:anchorId="7F0312CE" wp14:editId="33F5606C">
+            <wp:extent cx="6271803" cy="3101609"/>
+            <wp:effectExtent l="0" t="0" r="0" b="3810"/>
+            <wp:docPr id="817918607" name="Picture 1"/>
+            <wp:cNvGraphicFramePr>
+              <a:graphicFrameLocks xmlns:a="http://schemas.openxmlformats.org/drawingml/2006/main" noChangeAspect="1"/>
+            </wp:cNvGraphicFramePr>
+            <a:graphic xmlns:a="http://schemas.openxmlformats.org/drawingml/2006/main">
+              <a:graphicData uri="http://schemas.openxmlformats.org/drawingml/2006/picture">
+                <pic:pic xmlns:pic="http://schemas.openxmlformats.org/drawingml/2006/picture">
+                  <pic:nvPicPr>
+                    <pic:cNvPr id="817918607" name=""/>
+                    <pic:cNvPicPr/>
+                  </pic:nvPicPr>
+                  <pic:blipFill>
+                    <a:blip r:embed="rId14">
+                      <a:extLst>
+                        <a:ext uri="{28A0092B-C50C-407E-A947-70E740481C1C}">
+                          <a14:useLocalDpi xmlns:a14="http://schemas.microsoft.com/office/drawing/2010/main" val="0"/>
+                        </a:ext>
+                      </a:extLst>
+                    </a:blip>
+                    <a:stretch>
+                      <a:fillRect/>
+                    </a:stretch>
+                  </pic:blipFill>
+                  <pic:spPr>
+                    <a:xfrm>
+                      <a:off x="0" y="0"/>
+                      <a:ext cx="6271803" cy="3101609"/>
+                    </a:xfrm>
+                    <a:prstGeom prst="rect">
+                      <a:avLst/>
+                    </a:prstGeom>
+                  </pic:spPr>
+                </pic:pic>
+              </a:graphicData>
+            </a:graphic>
+          </wp:inline>
+        </w:drawing>
+      </w:r>
+    </w:p>
+    <w:p>
+      <w:pPr>
+        <w:spacing w:line="276" w:lineRule="auto"/>
+      </w:pPr>
       <w:r>
         <w:rPr>
           <w:noProof/>
         </w:rPr>
+        <w:lastRenderedPageBreak/>
         <w:drawing>
           <wp:inline distT="0" distB="0" distL="0" distR="0" wp14:anchorId="6421E108" wp14:editId="73113EBB">
             <wp:extent cx="6645910" cy="3789045"/>
@@ -2149,7 +2028,7 @@
                     <pic:cNvPicPr/>
                   </pic:nvPicPr>
                   <pic:blipFill>
-                    <a:blip r:embed="rId14">
+                    <a:blip r:embed="rId15">
                       <a:extLst>
                         <a:ext uri="{28A0092B-C50C-407E-A947-70E740481C1C}">
                           <a14:useLocalDpi xmlns:a14="http://schemas.microsoft.com/office/drawing/2010/main" val="0"/>
@@ -2182,14 +2061,8 @@
         <w:spacing w:line="276" w:lineRule="auto"/>
       </w:pPr>
       <w:r>
-        <w:lastRenderedPageBreak/>
-        <w:t xml:space="preserve">git pull origin </w:t>
-      </w:r>
-      <w:proofErr w:type="spellStart"/>
-      <w:r>
-        <w:t>branch_name</w:t>
-      </w:r>
-      <w:proofErr w:type="spellEnd"/>
+        <w:t>git pull origin branch_name</w:t>
+      </w:r>
     </w:p>
     <w:p>
       <w:pPr>
@@ -2210,15 +2083,7 @@
         <w:t>etches</w:t>
       </w:r>
       <w:r>
-        <w:t> the latest changes from the remote repository (origin) for the specified branch (</w:t>
-      </w:r>
-      <w:proofErr w:type="spellStart"/>
-      <w:r>
-        <w:t>branch_name</w:t>
-      </w:r>
-      <w:proofErr w:type="spellEnd"/>
-      <w:r>
-        <w:t>) and </w:t>
+        <w:t> the latest changes from the remote repository (origin) for the specified branch (branch_name) and </w:t>
       </w:r>
       <w:r>
         <w:rPr>
@@ -4934,6 +4799,7 @@
   <w:style w:type="character" w:default="1" w:styleId="DefaultParagraphFont">
     <w:name w:val="Default Paragraph Font"/>
     <w:uiPriority w:val="1"/>
+    <w:semiHidden/>
     <w:unhideWhenUsed/>
   </w:style>
   <w:style w:type="table" w:default="1" w:styleId="TableNormal">

</xml_diff>

<commit_message>
Final changes before lunch
</commit_message>
<xml_diff>
--- a/readme.docx
+++ b/readme.docx
@@ -80,7 +80,15 @@
       </w:r>
       <w:r>
         <w:br/>
-        <w:t>Replace myenv with your desired environment name.</w:t>
+        <w:t>Replace </w:t>
+      </w:r>
+      <w:proofErr w:type="spellStart"/>
+      <w:r>
+        <w:t>myenv</w:t>
+      </w:r>
+      <w:proofErr w:type="spellEnd"/>
+      <w:r>
+        <w:t> with your desired environment name.</w:t>
       </w:r>
     </w:p>
     <w:p>
@@ -91,8 +99,30 @@
         <w:rPr>
           <w:highlight w:val="lightGray"/>
         </w:rPr>
-        <w:t>python -m venv myenv</w:t>
-      </w:r>
+        <w:t>python -m </w:t>
+      </w:r>
+      <w:proofErr w:type="spellStart"/>
+      <w:r>
+        <w:rPr>
+          <w:highlight w:val="lightGray"/>
+        </w:rPr>
+        <w:t>venv</w:t>
+      </w:r>
+      <w:proofErr w:type="spellEnd"/>
+      <w:r>
+        <w:rPr>
+          <w:highlight w:val="lightGray"/>
+        </w:rPr>
+        <w:t> </w:t>
+      </w:r>
+      <w:proofErr w:type="spellStart"/>
+      <w:r>
+        <w:rPr>
+          <w:highlight w:val="lightGray"/>
+        </w:rPr>
+        <w:t>myenv</w:t>
+      </w:r>
+      <w:proofErr w:type="spellEnd"/>
     </w:p>
     <w:p>
       <w:pPr>
@@ -105,12 +135,21 @@
         </w:rPr>
         <w:t>2. Activate the environment (</w:t>
       </w:r>
-      <w:r>
-        <w:rPr>
-          <w:b/>
-          <w:bCs/>
-        </w:rPr>
-        <w:t>cmd set in VS code</w:t>
+      <w:proofErr w:type="spellStart"/>
+      <w:r>
+        <w:rPr>
+          <w:b/>
+          <w:bCs/>
+        </w:rPr>
+        <w:t>cmd</w:t>
+      </w:r>
+      <w:proofErr w:type="spellEnd"/>
+      <w:r>
+        <w:rPr>
+          <w:b/>
+          <w:bCs/>
+        </w:rPr>
+        <w:t xml:space="preserve"> set in VS code</w:t>
       </w:r>
       <w:r>
         <w:rPr>
@@ -262,7 +301,23 @@
           <w:i/>
           <w:iCs/>
         </w:rPr>
-        <w:t>pip install pandas numpy matplotlib</w:t>
+        <w:t xml:space="preserve">pip install pandas </w:t>
+      </w:r>
+      <w:proofErr w:type="spellStart"/>
+      <w:r>
+        <w:rPr>
+          <w:i/>
+          <w:iCs/>
+        </w:rPr>
+        <w:t>numpy</w:t>
+      </w:r>
+      <w:proofErr w:type="spellEnd"/>
+      <w:r>
+        <w:rPr>
+          <w:i/>
+          <w:iCs/>
+        </w:rPr>
+        <w:t xml:space="preserve"> matplotlib</w:t>
       </w:r>
     </w:p>
     <w:p>
@@ -376,7 +431,15 @@
         <w:spacing w:line="276" w:lineRule="auto"/>
       </w:pPr>
       <w:r>
-        <w:t>Choose the interpreter from the "vaibhav" environment (it will typically be listed as something like Python &lt;version&gt; ('vaibhav') or the path to the environment’s Python executable, e.g., ./vaibhav/bin/python or .\vaibhav\Scripts\python.exe)</w:t>
+        <w:t>Choose the interpreter from the "vaibhav" environment (it will typically be listed as something like Python &lt;version&gt; ('vaibhav') or the path to the environment’s Python executable, e.g.</w:t>
+      </w:r>
+      <w:proofErr w:type="gramStart"/>
+      <w:r>
+        <w:t>, .</w:t>
+      </w:r>
+      <w:proofErr w:type="gramEnd"/>
+      <w:r>
+        <w:t>/vaibhav/bin/python or .\vaibhav\Scripts\python.exe)</w:t>
       </w:r>
     </w:p>
     <w:p>
@@ -389,7 +452,25 @@
           <w:bCs/>
           <w:highlight w:val="yellow"/>
         </w:rPr>
-        <w:t>activated your venv in the terminal</w:t>
+        <w:t xml:space="preserve">activated your </w:t>
+      </w:r>
+      <w:proofErr w:type="spellStart"/>
+      <w:r>
+        <w:rPr>
+          <w:b/>
+          <w:bCs/>
+          <w:highlight w:val="yellow"/>
+        </w:rPr>
+        <w:t>venv</w:t>
+      </w:r>
+      <w:proofErr w:type="spellEnd"/>
+      <w:r>
+        <w:rPr>
+          <w:b/>
+          <w:bCs/>
+          <w:highlight w:val="yellow"/>
+        </w:rPr>
+        <w:t xml:space="preserve"> in the terminal</w:t>
       </w:r>
       <w:r>
         <w:rPr>
@@ -424,7 +505,15 @@
         <w:t>VS Code might use a different Python interpreter</w:t>
       </w:r>
       <w:r>
-        <w:t> (not your venv) when running or debugging code.</w:t>
+        <w:t xml:space="preserve"> (not your </w:t>
+      </w:r>
+      <w:proofErr w:type="spellStart"/>
+      <w:r>
+        <w:t>venv</w:t>
+      </w:r>
+      <w:proofErr w:type="spellEnd"/>
+      <w:r>
+        <w:t>) when running or debugging code.</w:t>
       </w:r>
     </w:p>
     <w:p>
@@ -440,7 +529,23 @@
           <w:bCs/>
         </w:rPr>
         <w:lastRenderedPageBreak/>
-        <w:t>Installed packages in your venv may not be found</w:t>
+        <w:t xml:space="preserve">Installed packages in your </w:t>
+      </w:r>
+      <w:proofErr w:type="spellStart"/>
+      <w:r>
+        <w:rPr>
+          <w:b/>
+          <w:bCs/>
+        </w:rPr>
+        <w:t>venv</w:t>
+      </w:r>
+      <w:proofErr w:type="spellEnd"/>
+      <w:r>
+        <w:rPr>
+          <w:b/>
+          <w:bCs/>
+        </w:rPr>
+        <w:t xml:space="preserve"> may not be found</w:t>
       </w:r>
       <w:r>
         <w:t> by VS Code, leading to import errors.</w:t>
@@ -461,7 +566,15 @@
         <w:t>Linting, IntelliSense, and code navigation</w:t>
       </w:r>
       <w:r>
-        <w:t> may not reflect your venv’s packages.</w:t>
+        <w:t xml:space="preserve"> may not reflect your </w:t>
+      </w:r>
+      <w:proofErr w:type="spellStart"/>
+      <w:r>
+        <w:t>venv’s</w:t>
+      </w:r>
+      <w:proofErr w:type="spellEnd"/>
+      <w:r>
+        <w:t xml:space="preserve"> packages.</w:t>
       </w:r>
     </w:p>
     <w:p>
@@ -479,7 +592,15 @@
         <w:t>Terminal commands</w:t>
       </w:r>
       <w:r>
-        <w:t> will use the venv, but running scripts with the VS Code "Run" button may not.</w:t>
+        <w:t xml:space="preserve"> will use the </w:t>
+      </w:r>
+      <w:proofErr w:type="spellStart"/>
+      <w:r>
+        <w:t>venv</w:t>
+      </w:r>
+      <w:proofErr w:type="spellEnd"/>
+      <w:r>
+        <w:t>, but running scripts with the VS Code "Run" button may not.</w:t>
       </w:r>
     </w:p>
     <w:p>
@@ -492,7 +613,15 @@
       </w:r>
       <w:r>
         <w:br/>
-        <w:t>Always select your venv as the Python interpreter in VS Code to ensure your code runs with the correct environment and dependencies.</w:t>
+        <w:t xml:space="preserve">Always select your </w:t>
+      </w:r>
+      <w:proofErr w:type="spellStart"/>
+      <w:r>
+        <w:t>venv</w:t>
+      </w:r>
+      <w:proofErr w:type="spellEnd"/>
+      <w:r>
+        <w:t xml:space="preserve"> as the Python interpreter in VS Code to ensure your code runs with the correct environment and dependencies.</w:t>
       </w:r>
     </w:p>
     <w:p>
@@ -735,7 +864,17 @@
         <w:ind w:left="360"/>
       </w:pPr>
       <w:r>
-        <w:t>git config --global user.email "vaibhav.kabdwal@gmail.com"</w:t>
+        <w:t xml:space="preserve">git config --global </w:t>
+      </w:r>
+      <w:proofErr w:type="spellStart"/>
+      <w:proofErr w:type="gramStart"/>
+      <w:r>
+        <w:t>user.email</w:t>
+      </w:r>
+      <w:proofErr w:type="spellEnd"/>
+      <w:proofErr w:type="gramEnd"/>
+      <w:r>
+        <w:t xml:space="preserve"> "vaibhav.kabdwal@gmail.com"</w:t>
       </w:r>
     </w:p>
     <w:p>
@@ -764,8 +903,15 @@
         <w:ind w:left="360"/>
       </w:pPr>
       <w:r>
-        <w:t>git config --global user.email</w:t>
-      </w:r>
+        <w:t xml:space="preserve">git config --global </w:t>
+      </w:r>
+      <w:proofErr w:type="spellStart"/>
+      <w:proofErr w:type="gramStart"/>
+      <w:r>
+        <w:t>user.email</w:t>
+      </w:r>
+      <w:proofErr w:type="spellEnd"/>
+      <w:proofErr w:type="gramEnd"/>
     </w:p>
     <w:p>
       <w:pPr>
@@ -798,8 +944,15 @@
         <w:ind w:left="360"/>
       </w:pPr>
       <w:r>
-        <w:t>git config user.email</w:t>
-      </w:r>
+        <w:t xml:space="preserve">git config </w:t>
+      </w:r>
+      <w:proofErr w:type="spellStart"/>
+      <w:proofErr w:type="gramStart"/>
+      <w:r>
+        <w:t>user.email</w:t>
+      </w:r>
+      <w:proofErr w:type="spellEnd"/>
+      <w:proofErr w:type="gramEnd"/>
     </w:p>
     <w:p>
       <w:pPr>
@@ -905,12 +1058,18 @@
       <w:r>
         <w:t xml:space="preserve"> </w:t>
       </w:r>
-      <w:r>
-        <w:t>yourusername/</w:t>
+      <w:proofErr w:type="spellStart"/>
+      <w:r>
+        <w:t>yourusername</w:t>
+      </w:r>
+      <w:proofErr w:type="spellEnd"/>
+      <w:r>
+        <w:t>/</w:t>
       </w:r>
       <w:r>
         <w:t xml:space="preserve"> </w:t>
       </w:r>
+      <w:proofErr w:type="spellStart"/>
       <w:r>
         <w:t>your</w:t>
       </w:r>
@@ -918,7 +1077,11 @@
         <w:t>_</w:t>
       </w:r>
       <w:r>
-        <w:t>repo.git).</w:t>
+        <w:t>repo.git</w:t>
+      </w:r>
+      <w:proofErr w:type="spellEnd"/>
+      <w:r>
+        <w:t>).</w:t>
       </w:r>
     </w:p>
     <w:p>
@@ -1053,7 +1216,15 @@
         <w:ind w:left="1080"/>
       </w:pPr>
       <w:r>
-        <w:t>git add &lt;file&gt; (or git add .) stages your changes.</w:t>
+        <w:t xml:space="preserve">git add &lt;file&gt; (or git </w:t>
+      </w:r>
+      <w:proofErr w:type="gramStart"/>
+      <w:r>
+        <w:t>add .</w:t>
+      </w:r>
+      <w:proofErr w:type="gramEnd"/>
+      <w:r>
+        <w:t>) stages your changes.</w:t>
       </w:r>
     </w:p>
     <w:p>
@@ -1269,8 +1440,16 @@
         <w:rPr>
           <w:shd w:val="clear" w:color="auto" w:fill="F2F2F2" w:themeFill="background1" w:themeFillShade="F2"/>
         </w:rPr>
-        <w:t>git push origin branch_name</w:t>
-      </w:r>
+        <w:t xml:space="preserve">git push origin </w:t>
+      </w:r>
+      <w:proofErr w:type="spellStart"/>
+      <w:r>
+        <w:rPr>
+          <w:shd w:val="clear" w:color="auto" w:fill="F2F2F2" w:themeFill="background1" w:themeFillShade="F2"/>
+        </w:rPr>
+        <w:t>branch_name</w:t>
+      </w:r>
+      <w:proofErr w:type="spellEnd"/>
     </w:p>
     <w:p>
       <w:pPr>
@@ -1281,7 +1460,15 @@
         </w:rPr>
       </w:pPr>
       <w:r>
-        <w:t>For example, to push to revision_questions:</w:t>
+        <w:t xml:space="preserve">For example, to push to </w:t>
+      </w:r>
+      <w:proofErr w:type="spellStart"/>
+      <w:r>
+        <w:t>revision_questions</w:t>
+      </w:r>
+      <w:proofErr w:type="spellEnd"/>
+      <w:r>
+        <w:t>:</w:t>
       </w:r>
       <w:r>
         <w:t xml:space="preserve"> </w:t>
@@ -1290,8 +1477,16 @@
         <w:rPr>
           <w:shd w:val="clear" w:color="auto" w:fill="F2F2F2" w:themeFill="background1" w:themeFillShade="F2"/>
         </w:rPr>
-        <w:t>git push origin revision_questions</w:t>
-      </w:r>
+        <w:t xml:space="preserve">git push origin </w:t>
+      </w:r>
+      <w:proofErr w:type="spellStart"/>
+      <w:r>
+        <w:rPr>
+          <w:shd w:val="clear" w:color="auto" w:fill="F2F2F2" w:themeFill="background1" w:themeFillShade="F2"/>
+        </w:rPr>
+        <w:t>revision_questions</w:t>
+      </w:r>
+      <w:proofErr w:type="spellEnd"/>
     </w:p>
     <w:p>
       <w:pPr>
@@ -1548,7 +1743,15 @@
         <w:spacing w:line="276" w:lineRule="auto"/>
       </w:pPr>
       <w:r>
-        <w:t>git clone &lt;repo-url&gt; &lt;folder-path&gt;</w:t>
+        <w:t>git clone &lt;repo-</w:t>
+      </w:r>
+      <w:proofErr w:type="spellStart"/>
+      <w:r>
+        <w:t>url</w:t>
+      </w:r>
+      <w:proofErr w:type="spellEnd"/>
+      <w:r>
+        <w:t>&gt; &lt;folder-path&gt;</w:t>
       </w:r>
     </w:p>
     <w:p>
@@ -2061,8 +2264,13 @@
         <w:spacing w:line="276" w:lineRule="auto"/>
       </w:pPr>
       <w:r>
-        <w:t>git pull origin branch_name</w:t>
-      </w:r>
+        <w:t xml:space="preserve">git pull origin </w:t>
+      </w:r>
+      <w:proofErr w:type="spellStart"/>
+      <w:r>
+        <w:t>branch_name</w:t>
+      </w:r>
+      <w:proofErr w:type="spellEnd"/>
     </w:p>
     <w:p>
       <w:pPr>
@@ -2083,7 +2291,15 @@
         <w:t>etches</w:t>
       </w:r>
       <w:r>
-        <w:t> the latest changes from the remote repository (origin) for the specified branch (branch_name) and </w:t>
+        <w:t> the latest changes from the remote repository (origin) for the specified branch (</w:t>
+      </w:r>
+      <w:proofErr w:type="spellStart"/>
+      <w:r>
+        <w:t>branch_name</w:t>
+      </w:r>
+      <w:proofErr w:type="spellEnd"/>
+      <w:r>
+        <w:t>) and </w:t>
       </w:r>
       <w:r>
         <w:rPr>
@@ -2119,6 +2335,117 @@
       </w:r>
       <w:r>
         <w:t xml:space="preserve">. </w:t>
+      </w:r>
+    </w:p>
+    <w:p>
+      <w:pPr>
+        <w:pStyle w:val="ListParagraph"/>
+        <w:numPr>
+          <w:ilvl w:val="0"/>
+          <w:numId w:val="14"/>
+        </w:numPr>
+        <w:spacing w:line="276" w:lineRule="auto"/>
+      </w:pPr>
+      <w:r>
+        <w:t xml:space="preserve">You want to merge changes from the </w:t>
+      </w:r>
+      <w:proofErr w:type="spellStart"/>
+      <w:r>
+        <w:t>revision_questions</w:t>
+      </w:r>
+      <w:proofErr w:type="spellEnd"/>
+      <w:r>
+        <w:t xml:space="preserve"> branch into the main branch in your online GitHub repository (https://github.com/vkabdwal/vscode_vk.git, referred to as online-</w:t>
+      </w:r>
+      <w:proofErr w:type="spellStart"/>
+      <w:r>
+        <w:t>vscode</w:t>
+      </w:r>
+      <w:proofErr w:type="spellEnd"/>
+      <w:r>
+        <w:t>-</w:t>
+      </w:r>
+      <w:proofErr w:type="spellStart"/>
+      <w:r>
+        <w:t>vk</w:t>
+      </w:r>
+      <w:proofErr w:type="spellEnd"/>
+      <w:r>
+        <w:t>), using your local repository (D:\</w:t>
+      </w:r>
+      <w:proofErr w:type="spellStart"/>
+      <w:r>
+        <w:t>Github</w:t>
+      </w:r>
+      <w:proofErr w:type="spellEnd"/>
+      <w:r>
+        <w:t>\</w:t>
+      </w:r>
+      <w:proofErr w:type="spellStart"/>
+      <w:r>
+        <w:t>myproject_local</w:t>
+      </w:r>
+      <w:proofErr w:type="spellEnd"/>
+      <w:r>
+        <w:t>, referred to as local-</w:t>
+      </w:r>
+      <w:proofErr w:type="spellStart"/>
+      <w:r>
+        <w:t>myproject</w:t>
+      </w:r>
+      <w:proofErr w:type="spellEnd"/>
+      <w:r>
+        <w:t xml:space="preserve">). This can be done by creating a pull request (PR) on GitHub to merge </w:t>
+      </w:r>
+      <w:proofErr w:type="spellStart"/>
+      <w:r>
+        <w:t>revision_questions</w:t>
+      </w:r>
+      <w:proofErr w:type="spellEnd"/>
+      <w:r>
+        <w:t xml:space="preserve"> into main, or by performing the merge locally and pushing the updated main branch. Below is a precise, intuitive guide to accomplish this, tailored to your technical background, with steps for both methods.</w:t>
+      </w:r>
+    </w:p>
+    <w:p>
+      <w:pPr>
+        <w:spacing w:line="276" w:lineRule="auto"/>
+        <w:ind w:left="360"/>
+        <w:rPr>
+          <w:b/>
+          <w:bCs/>
+        </w:rPr>
+      </w:pPr>
+      <w:r>
+        <w:rPr>
+          <w:b/>
+          <w:bCs/>
+        </w:rPr>
+        <w:t>Intuitive Understanding</w:t>
+      </w:r>
+    </w:p>
+    <w:p>
+      <w:pPr>
+        <w:spacing w:line="276" w:lineRule="auto"/>
+        <w:ind w:left="360"/>
+      </w:pPr>
+      <w:r>
+        <w:t xml:space="preserve">Think of </w:t>
+      </w:r>
+      <w:proofErr w:type="spellStart"/>
+      <w:r>
+        <w:t>revision_questions</w:t>
+      </w:r>
+      <w:proofErr w:type="spellEnd"/>
+      <w:r>
+        <w:t xml:space="preserve"> as a working draft of your project (e.g., updated readme.docx or other files) and main as the stable version. Merging </w:t>
+      </w:r>
+      <w:proofErr w:type="spellStart"/>
+      <w:r>
+        <w:t>revision_questions</w:t>
+      </w:r>
+      <w:proofErr w:type="spellEnd"/>
+      <w:r>
+        <w:t xml:space="preserve"> into main is like incorporating your draft changes into the final document. A pull request on GitHub is the preferred method for reviewing and merging changes, especially in collaborative projects, as it allows you to verify diffs and handle conflicts. Alternatively, merging locally gives you more control but requires pushing the updated main branch.</w:t>
       </w:r>
     </w:p>
     <w:p>
@@ -3739,7 +4066,7 @@
   <w:abstractNum w:abstractNumId="12" w15:restartNumberingAfterBreak="0">
     <w:nsid w:val="6C9862C5"/>
     <w:multiLevelType w:val="hybridMultilevel"/>
-    <w:tmpl w:val="7D4C2BBE"/>
+    <w:tmpl w:val="55DC69BE"/>
     <w:lvl w:ilvl="0" w:tplc="40090001">
       <w:start w:val="1"/>
       <w:numFmt w:val="bullet"/>
@@ -4799,7 +5126,6 @@
   <w:style w:type="character" w:default="1" w:styleId="DefaultParagraphFont">
     <w:name w:val="Default Paragraph Font"/>
     <w:uiPriority w:val="1"/>
-    <w:semiHidden/>
     <w:unhideWhenUsed/>
   </w:style>
   <w:style w:type="table" w:default="1" w:styleId="TableNormal">

</xml_diff>

<commit_message>
First commit to the readme file 19th Oct
</commit_message>
<xml_diff>
--- a/readme.docx
+++ b/readme.docx
@@ -1508,9 +1508,9 @@
         </w:rPr>
         <w:lastRenderedPageBreak/>
         <w:drawing>
-          <wp:inline distT="0" distB="0" distL="0" distR="0" wp14:anchorId="11432AA3" wp14:editId="2B4F0634">
-            <wp:extent cx="4595750" cy="3336589"/>
-            <wp:effectExtent l="0" t="0" r="0" b="0"/>
+          <wp:inline distT="0" distB="0" distL="0" distR="0" wp14:anchorId="11432AA3" wp14:editId="08E54D73">
+            <wp:extent cx="4184650" cy="3336290"/>
+            <wp:effectExtent l="0" t="0" r="6350" b="0"/>
             <wp:docPr id="756762439" name="Picture 1"/>
             <wp:cNvGraphicFramePr>
               <a:graphicFrameLocks xmlns:a="http://schemas.openxmlformats.org/drawingml/2006/main" noChangeAspect="1"/>
@@ -1537,7 +1537,7 @@
                   <pic:spPr>
                     <a:xfrm>
                       <a:off x="0" y="0"/>
-                      <a:ext cx="4607441" cy="3345077"/>
+                      <a:ext cx="4195671" cy="3345077"/>
                     </a:xfrm>
                     <a:prstGeom prst="rect">
                       <a:avLst/>
@@ -1600,9 +1600,9 @@
           <w:noProof/>
         </w:rPr>
         <w:drawing>
-          <wp:inline distT="0" distB="0" distL="0" distR="0" wp14:anchorId="2CC8B39C" wp14:editId="1C10D27A">
-            <wp:extent cx="4905375" cy="2907323"/>
-            <wp:effectExtent l="0" t="0" r="0" b="7620"/>
+          <wp:inline distT="0" distB="0" distL="0" distR="0" wp14:anchorId="2CC8B39C" wp14:editId="0D56CF62">
+            <wp:extent cx="4095750" cy="2362200"/>
+            <wp:effectExtent l="0" t="0" r="0" b="0"/>
             <wp:docPr id="275131296" name="Picture 1"/>
             <wp:cNvGraphicFramePr>
               <a:graphicFrameLocks xmlns:a="http://schemas.openxmlformats.org/drawingml/2006/main" noChangeAspect="1"/>
@@ -1630,7 +1630,7 @@
                   <pic:spPr bwMode="auto">
                     <a:xfrm>
                       <a:off x="0" y="0"/>
-                      <a:ext cx="4907132" cy="2908364"/>
+                      <a:ext cx="4097630" cy="2363284"/>
                     </a:xfrm>
                     <a:prstGeom prst="rect">
                       <a:avLst/>
@@ -1655,19 +1655,13 @@
       <w:pPr>
         <w:spacing w:line="360" w:lineRule="auto"/>
       </w:pPr>
-    </w:p>
-    <w:p>
-      <w:pPr>
-        <w:spacing w:line="360" w:lineRule="auto"/>
-      </w:pPr>
       <w:r>
         <w:rPr>
           <w:noProof/>
         </w:rPr>
-        <w:lastRenderedPageBreak/>
         <w:drawing>
-          <wp:inline distT="0" distB="0" distL="0" distR="0" wp14:anchorId="77D94DCE" wp14:editId="59816365">
-            <wp:extent cx="4905375" cy="2750653"/>
+          <wp:inline distT="0" distB="0" distL="0" distR="0" wp14:anchorId="77D94DCE" wp14:editId="784FF3D5">
+            <wp:extent cx="4044950" cy="2190750"/>
             <wp:effectExtent l="0" t="0" r="0" b="0"/>
             <wp:docPr id="1521374749" name="Picture 1"/>
             <wp:cNvGraphicFramePr>
@@ -1696,7 +1690,7 @@
                   <pic:spPr bwMode="auto">
                     <a:xfrm>
                       <a:off x="0" y="0"/>
-                      <a:ext cx="4907132" cy="2751638"/>
+                      <a:ext cx="4047090" cy="2191909"/>
                     </a:xfrm>
                     <a:prstGeom prst="rect">
                       <a:avLst/>
@@ -1722,6 +1716,7 @@
         <w:spacing w:line="360" w:lineRule="auto"/>
       </w:pPr>
       <w:r>
+        <w:lastRenderedPageBreak/>
         <w:t>When you use git clone, you can specify the folder location by adding a path at the end of the command.</w:t>
       </w:r>
     </w:p>
@@ -1785,7 +1780,14 @@
         <w:spacing w:line="276" w:lineRule="auto"/>
       </w:pPr>
       <w:r>
-        <w:t xml:space="preserve">e.g. </w:t>
+        <w:rPr>
+          <w:b/>
+          <w:bCs/>
+        </w:rPr>
+        <w:t>e.g.</w:t>
+      </w:r>
+      <w:r>
+        <w:t xml:space="preserve"> </w:t>
       </w:r>
       <w:r>
         <w:t xml:space="preserve">git clone </w:t>
@@ -1864,11 +1866,6 @@
       <w:pPr>
         <w:spacing w:line="276" w:lineRule="auto"/>
       </w:pPr>
-    </w:p>
-    <w:p>
-      <w:pPr>
-        <w:spacing w:line="276" w:lineRule="auto"/>
-      </w:pPr>
       <w:r>
         <w:tab/>
       </w:r>
@@ -1927,7 +1924,6 @@
         <w:rPr>
           <w:noProof/>
         </w:rPr>
-        <w:lastRenderedPageBreak/>
         <w:drawing>
           <wp:inline distT="0" distB="0" distL="0" distR="0" wp14:anchorId="6C088930" wp14:editId="1E408019">
             <wp:extent cx="6153404" cy="3194148"/>
@@ -1989,6 +1985,7 @@
         <w:rPr>
           <w:noProof/>
         </w:rPr>
+        <w:lastRenderedPageBreak/>
         <w:drawing>
           <wp:inline distT="0" distB="0" distL="0" distR="0" wp14:anchorId="0667F556" wp14:editId="2508DE68">
             <wp:extent cx="6388016" cy="3622431"/>
@@ -2049,7 +2046,6 @@
         <w:rPr>
           <w:noProof/>
         </w:rPr>
-        <w:lastRenderedPageBreak/>
         <w:drawing>
           <wp:inline distT="0" distB="0" distL="0" distR="0" wp14:anchorId="1B417A04" wp14:editId="214C2932">
             <wp:extent cx="6487388" cy="2731477"/>
@@ -2163,6 +2159,7 @@
         <w:spacing w:line="276" w:lineRule="auto"/>
       </w:pPr>
       <w:r>
+        <w:lastRenderedPageBreak/>
         <w:drawing>
           <wp:inline distT="0" distB="0" distL="0" distR="0" wp14:anchorId="7F0312CE" wp14:editId="33F5606C">
             <wp:extent cx="6271803" cy="3101609"/>
@@ -2208,18 +2205,227 @@
     </w:p>
     <w:p>
       <w:pPr>
+        <w:shd w:val="clear" w:color="auto" w:fill="F2F2F2" w:themeFill="background1" w:themeFillShade="F2"/>
         <w:spacing w:line="276" w:lineRule="auto"/>
       </w:pPr>
       <w:r>
-        <w:rPr>
-          <w:noProof/>
-        </w:rPr>
+        <w:t xml:space="preserve">git pull origin </w:t>
+      </w:r>
+      <w:proofErr w:type="spellStart"/>
+      <w:r>
+        <w:t>branch_name</w:t>
+      </w:r>
+      <w:proofErr w:type="spellEnd"/>
+    </w:p>
+    <w:p>
+      <w:pPr>
+        <w:spacing w:line="276" w:lineRule="auto"/>
+      </w:pPr>
+      <w:r>
+        <w:rPr>
+          <w:b/>
+          <w:bCs/>
+        </w:rPr>
+        <w:t>F</w:t>
+      </w:r>
+      <w:r>
+        <w:rPr>
+          <w:b/>
+          <w:bCs/>
+        </w:rPr>
+        <w:t>etches</w:t>
+      </w:r>
+      <w:r>
+        <w:t> the latest changes from the remote repository (origin) for the specified branch (</w:t>
+      </w:r>
+      <w:proofErr w:type="spellStart"/>
+      <w:r>
+        <w:t>branch_name</w:t>
+      </w:r>
+      <w:proofErr w:type="spellEnd"/>
+      <w:r>
+        <w:t>) and </w:t>
+      </w:r>
+      <w:r>
+        <w:rPr>
+          <w:b/>
+          <w:bCs/>
+        </w:rPr>
+        <w:t>merges</w:t>
+      </w:r>
+      <w:r>
+        <w:t> them into your current local branch.</w:t>
+      </w:r>
+    </w:p>
+    <w:p>
+      <w:pPr>
+        <w:spacing w:line="276" w:lineRule="auto"/>
+      </w:pPr>
+      <w:r>
+        <w:rPr>
+          <w:b/>
+          <w:bCs/>
+        </w:rPr>
+        <w:t>In short:</w:t>
+      </w:r>
+      <w:r>
+        <w:br/>
+        <w:t>It updates your local branch with any new commits from the same branch on GitHub.</w:t>
+      </w:r>
+      <w:r>
+        <w:t xml:space="preserve"> </w:t>
+      </w:r>
+      <w:r>
+        <w:t>Cloning copies the entire repository, including all branches, to your local machine</w:t>
+      </w:r>
+      <w:r>
+        <w:t xml:space="preserve">. </w:t>
+      </w:r>
+    </w:p>
+    <w:p>
+      <w:pPr>
+        <w:pStyle w:val="ListParagraph"/>
+        <w:numPr>
+          <w:ilvl w:val="0"/>
+          <w:numId w:val="14"/>
+        </w:numPr>
+        <w:spacing w:line="276" w:lineRule="auto"/>
+      </w:pPr>
+      <w:r>
+        <w:t xml:space="preserve">You want to merge changes from the </w:t>
+      </w:r>
+      <w:proofErr w:type="spellStart"/>
+      <w:r>
+        <w:t>revision_questions</w:t>
+      </w:r>
+      <w:proofErr w:type="spellEnd"/>
+      <w:r>
+        <w:t xml:space="preserve"> branch into the main branch in your online GitHub repository (https://github.com/vkabdwal/vscode_vk.git, referred to as online-</w:t>
+      </w:r>
+      <w:proofErr w:type="spellStart"/>
+      <w:r>
+        <w:t>vscode</w:t>
+      </w:r>
+      <w:proofErr w:type="spellEnd"/>
+      <w:r>
+        <w:t>-</w:t>
+      </w:r>
+      <w:proofErr w:type="spellStart"/>
+      <w:r>
+        <w:t>vk</w:t>
+      </w:r>
+      <w:proofErr w:type="spellEnd"/>
+      <w:r>
+        <w:t>), using your local repository (D:\</w:t>
+      </w:r>
+      <w:proofErr w:type="spellStart"/>
+      <w:r>
+        <w:t>Github</w:t>
+      </w:r>
+      <w:proofErr w:type="spellEnd"/>
+      <w:r>
+        <w:t>\</w:t>
+      </w:r>
+      <w:proofErr w:type="spellStart"/>
+      <w:r>
+        <w:t>myproject_local</w:t>
+      </w:r>
+      <w:proofErr w:type="spellEnd"/>
+      <w:r>
+        <w:t>, referred to as local-</w:t>
+      </w:r>
+      <w:proofErr w:type="spellStart"/>
+      <w:r>
+        <w:t>myproject</w:t>
+      </w:r>
+      <w:proofErr w:type="spellEnd"/>
+      <w:r>
+        <w:t xml:space="preserve">). This can be done by creating a pull request (PR) on GitHub to merge </w:t>
+      </w:r>
+      <w:proofErr w:type="spellStart"/>
+      <w:r>
+        <w:t>revision_questions</w:t>
+      </w:r>
+      <w:proofErr w:type="spellEnd"/>
+      <w:r>
+        <w:t xml:space="preserve"> into main, or by performing the merge locally and pushing the updated main branch. Below is a precise, intuitive guide to accomplish this, tailored to your technical background, with steps for both methods.</w:t>
+      </w:r>
+    </w:p>
+    <w:p>
+      <w:pPr>
+        <w:spacing w:line="276" w:lineRule="auto"/>
+        <w:ind w:left="360"/>
+        <w:rPr>
+          <w:b/>
+          <w:bCs/>
+        </w:rPr>
+      </w:pPr>
+      <w:r>
+        <w:rPr>
+          <w:b/>
+          <w:bCs/>
+        </w:rPr>
+        <w:t>Intuitive Understanding</w:t>
+      </w:r>
+    </w:p>
+    <w:p>
+      <w:pPr>
+        <w:spacing w:line="276" w:lineRule="auto"/>
+        <w:ind w:left="360"/>
+      </w:pPr>
+      <w:r>
+        <w:t xml:space="preserve">Think of </w:t>
+      </w:r>
+      <w:proofErr w:type="spellStart"/>
+      <w:r>
+        <w:t>revision_questions</w:t>
+      </w:r>
+      <w:proofErr w:type="spellEnd"/>
+      <w:r>
+        <w:t xml:space="preserve"> as a working draft of your project (e.g., updated readme.docx or other files) and main as the stable version. Merging </w:t>
+      </w:r>
+      <w:proofErr w:type="spellStart"/>
+      <w:r>
+        <w:t>revision_questions</w:t>
+      </w:r>
+      <w:proofErr w:type="spellEnd"/>
+      <w:r>
+        <w:t xml:space="preserve"> into main is like incorporating your draft changes into the final document. A pull request on GitHub is the preferred method for reviewing and merging changes, especially in collaborative projects, as it allows you to verify diffs and handle conflicts. Alternatively, merging locally gives you more control but requires pushing the updated main branch.</w:t>
+      </w:r>
+    </w:p>
+    <w:p>
+      <w:pPr>
+        <w:pStyle w:val="ListParagraph"/>
+        <w:numPr>
+          <w:ilvl w:val="0"/>
+          <w:numId w:val="14"/>
+        </w:numPr>
+        <w:spacing w:line="276" w:lineRule="auto"/>
+      </w:pPr>
+      <w:r>
+        <w:t>To refresh your local Visual Studio Code (VS Code) to reflect a new branch added to your GitHub repository, you need to fetch the new branch from the remote repository and ensure your local repository is in sync. Since VS Code is already connected to your Git repository, you can use either the built-in Git integration in VS Code or the terminal.</w:t>
+      </w:r>
+    </w:p>
+    <w:p>
+      <w:pPr>
+        <w:pStyle w:val="ListParagraph"/>
+        <w:spacing w:line="276" w:lineRule="auto"/>
+        <w:ind w:left="360"/>
+      </w:pPr>
+    </w:p>
+    <w:p>
+      <w:pPr>
+        <w:pStyle w:val="ListParagraph"/>
+        <w:spacing w:line="276" w:lineRule="auto"/>
+        <w:ind w:left="360"/>
+      </w:pPr>
+      <w:r>
         <w:lastRenderedPageBreak/>
         <w:drawing>
-          <wp:inline distT="0" distB="0" distL="0" distR="0" wp14:anchorId="6421E108" wp14:editId="73113EBB">
-            <wp:extent cx="6645910" cy="3789045"/>
-            <wp:effectExtent l="0" t="0" r="2540" b="1905"/>
-            <wp:docPr id="590453475" name="Picture 1"/>
+          <wp:inline distT="0" distB="0" distL="0" distR="0" wp14:anchorId="3904AF34" wp14:editId="6A46CA4E">
+            <wp:extent cx="6645910" cy="4520565"/>
+            <wp:effectExtent l="0" t="0" r="2540" b="0"/>
+            <wp:docPr id="1117222118" name="Picture 1"/>
             <wp:cNvGraphicFramePr>
               <a:graphicFrameLocks xmlns:a="http://schemas.openxmlformats.org/drawingml/2006/main" noChangeAspect="1"/>
             </wp:cNvGraphicFramePr>
@@ -2227,7 +2433,7 @@
               <a:graphicData uri="http://schemas.openxmlformats.org/drawingml/2006/picture">
                 <pic:pic xmlns:pic="http://schemas.openxmlformats.org/drawingml/2006/picture">
                   <pic:nvPicPr>
-                    <pic:cNvPr id="590453475" name=""/>
+                    <pic:cNvPr id="1117222118" name=""/>
                     <pic:cNvPicPr/>
                   </pic:nvPicPr>
                   <pic:blipFill>
@@ -2245,7 +2451,7 @@
                   <pic:spPr>
                     <a:xfrm>
                       <a:off x="0" y="0"/>
-                      <a:ext cx="6645910" cy="3789045"/>
+                      <a:ext cx="6645910" cy="4520565"/>
                     </a:xfrm>
                     <a:prstGeom prst="rect">
                       <a:avLst/>
@@ -2260,198 +2466,52 @@
     </w:p>
     <w:p>
       <w:pPr>
-        <w:shd w:val="clear" w:color="auto" w:fill="F2F2F2" w:themeFill="background1" w:themeFillShade="F2"/>
-        <w:spacing w:line="276" w:lineRule="auto"/>
-      </w:pPr>
-      <w:r>
-        <w:t xml:space="preserve">git pull origin </w:t>
-      </w:r>
-      <w:proofErr w:type="spellStart"/>
-      <w:r>
-        <w:t>branch_name</w:t>
-      </w:r>
-      <w:proofErr w:type="spellEnd"/>
-    </w:p>
-    <w:p>
-      <w:pPr>
-        <w:spacing w:line="276" w:lineRule="auto"/>
-      </w:pPr>
-      <w:r>
-        <w:rPr>
-          <w:b/>
-          <w:bCs/>
-        </w:rPr>
-        <w:t>F</w:t>
-      </w:r>
-      <w:r>
-        <w:rPr>
-          <w:b/>
-          <w:bCs/>
-        </w:rPr>
-        <w:t>etches</w:t>
-      </w:r>
-      <w:r>
-        <w:t> the latest changes from the remote repository (origin) for the specified branch (</w:t>
-      </w:r>
-      <w:proofErr w:type="spellStart"/>
-      <w:r>
-        <w:t>branch_name</w:t>
-      </w:r>
-      <w:proofErr w:type="spellEnd"/>
-      <w:r>
-        <w:t>) and </w:t>
-      </w:r>
-      <w:r>
-        <w:rPr>
-          <w:b/>
-          <w:bCs/>
-        </w:rPr>
-        <w:t>merges</w:t>
-      </w:r>
-      <w:r>
-        <w:t> them into your current local branch.</w:t>
-      </w:r>
-    </w:p>
-    <w:p>
-      <w:pPr>
-        <w:spacing w:line="276" w:lineRule="auto"/>
-      </w:pPr>
-      <w:r>
-        <w:rPr>
-          <w:b/>
-          <w:bCs/>
-        </w:rPr>
-        <w:t>In short:</w:t>
-      </w:r>
-      <w:r>
-        <w:br/>
-        <w:t>It updates your local branch with any new commits from the same branch on GitHub.</w:t>
-      </w:r>
-      <w:r>
-        <w:t xml:space="preserve"> </w:t>
-      </w:r>
-      <w:r>
-        <w:t>Cloning copies the entire repository, including all branches, to your local machine</w:t>
-      </w:r>
-      <w:r>
-        <w:t xml:space="preserve">. </w:t>
-      </w:r>
-    </w:p>
-    <w:p>
-      <w:pPr>
-        <w:pStyle w:val="ListParagraph"/>
-        <w:numPr>
-          <w:ilvl w:val="0"/>
-          <w:numId w:val="14"/>
-        </w:numPr>
-        <w:spacing w:line="276" w:lineRule="auto"/>
-      </w:pPr>
-      <w:r>
-        <w:t xml:space="preserve">You want to merge changes from the </w:t>
-      </w:r>
-      <w:proofErr w:type="spellStart"/>
-      <w:r>
-        <w:t>revision_questions</w:t>
-      </w:r>
-      <w:proofErr w:type="spellEnd"/>
-      <w:r>
-        <w:t xml:space="preserve"> branch into the main branch in your online GitHub repository (https://github.com/vkabdwal/vscode_vk.git, referred to as online-</w:t>
-      </w:r>
-      <w:proofErr w:type="spellStart"/>
-      <w:r>
-        <w:t>vscode</w:t>
-      </w:r>
-      <w:proofErr w:type="spellEnd"/>
-      <w:r>
-        <w:t>-</w:t>
-      </w:r>
-      <w:proofErr w:type="spellStart"/>
-      <w:r>
-        <w:t>vk</w:t>
-      </w:r>
-      <w:proofErr w:type="spellEnd"/>
-      <w:r>
-        <w:t>), using your local repository (D:\</w:t>
-      </w:r>
-      <w:proofErr w:type="spellStart"/>
-      <w:r>
-        <w:t>Github</w:t>
-      </w:r>
-      <w:proofErr w:type="spellEnd"/>
-      <w:r>
-        <w:t>\</w:t>
-      </w:r>
-      <w:proofErr w:type="spellStart"/>
-      <w:r>
-        <w:t>myproject_local</w:t>
-      </w:r>
-      <w:proofErr w:type="spellEnd"/>
-      <w:r>
-        <w:t>, referred to as local-</w:t>
-      </w:r>
-      <w:proofErr w:type="spellStart"/>
-      <w:r>
-        <w:t>myproject</w:t>
-      </w:r>
-      <w:proofErr w:type="spellEnd"/>
-      <w:r>
-        <w:t xml:space="preserve">). This can be done by creating a pull request (PR) on GitHub to merge </w:t>
-      </w:r>
-      <w:proofErr w:type="spellStart"/>
-      <w:r>
-        <w:t>revision_questions</w:t>
-      </w:r>
-      <w:proofErr w:type="spellEnd"/>
-      <w:r>
-        <w:t xml:space="preserve"> into main, or by performing the merge locally and pushing the updated main branch. Below is a precise, intuitive guide to accomplish this, tailored to your technical background, with steps for both methods.</w:t>
-      </w:r>
-    </w:p>
-    <w:p>
-      <w:pPr>
         <w:spacing w:line="276" w:lineRule="auto"/>
         <w:ind w:left="360"/>
-        <w:rPr>
-          <w:b/>
-          <w:bCs/>
-        </w:rPr>
-      </w:pPr>
-      <w:r>
-        <w:rPr>
-          <w:b/>
-          <w:bCs/>
-        </w:rPr>
-        <w:t>Intuitive Understanding</w:t>
-      </w:r>
-    </w:p>
-    <w:p>
-      <w:pPr>
-        <w:spacing w:line="276" w:lineRule="auto"/>
-        <w:ind w:left="360"/>
-      </w:pPr>
-      <w:r>
-        <w:t xml:space="preserve">Think of </w:t>
-      </w:r>
-      <w:proofErr w:type="spellStart"/>
-      <w:r>
-        <w:t>revision_questions</w:t>
-      </w:r>
-      <w:proofErr w:type="spellEnd"/>
-      <w:r>
-        <w:t xml:space="preserve"> as a working draft of your project (e.g., updated readme.docx or other files) and main as the stable version. Merging </w:t>
-      </w:r>
-      <w:proofErr w:type="spellStart"/>
-      <w:r>
-        <w:t>revision_questions</w:t>
-      </w:r>
-      <w:proofErr w:type="spellEnd"/>
-      <w:r>
-        <w:t xml:space="preserve"> into main is like incorporating your draft changes into the final document. A pull request on GitHub is the preferred method for reviewing and merging changes, especially in collaborative projects, as it allows you to verify diffs and handle conflicts. Alternatively, merging locally gives you more control but requires pushing the updated main branch.</w:t>
-      </w:r>
-    </w:p>
-    <w:p>
-      <w:pPr>
-        <w:spacing w:line="276" w:lineRule="auto"/>
-      </w:pPr>
+      </w:pPr>
+      <w:r>
+        <w:drawing>
+          <wp:inline distT="0" distB="0" distL="0" distR="0" wp14:anchorId="2B2DB5D4" wp14:editId="15D041C3">
+            <wp:extent cx="6521450" cy="3041527"/>
+            <wp:effectExtent l="0" t="0" r="0" b="6985"/>
+            <wp:docPr id="704996966" name="Picture 1"/>
+            <wp:cNvGraphicFramePr>
+              <a:graphicFrameLocks xmlns:a="http://schemas.openxmlformats.org/drawingml/2006/main" noChangeAspect="1"/>
+            </wp:cNvGraphicFramePr>
+            <a:graphic xmlns:a="http://schemas.openxmlformats.org/drawingml/2006/main">
+              <a:graphicData uri="http://schemas.openxmlformats.org/drawingml/2006/picture">
+                <pic:pic xmlns:pic="http://schemas.openxmlformats.org/drawingml/2006/picture">
+                  <pic:nvPicPr>
+                    <pic:cNvPr id="704996966" name=""/>
+                    <pic:cNvPicPr/>
+                  </pic:nvPicPr>
+                  <pic:blipFill>
+                    <a:blip r:embed="rId16">
+                      <a:extLst>
+                        <a:ext uri="{28A0092B-C50C-407E-A947-70E740481C1C}">
+                          <a14:useLocalDpi xmlns:a14="http://schemas.microsoft.com/office/drawing/2010/main" val="0"/>
+                        </a:ext>
+                      </a:extLst>
+                    </a:blip>
+                    <a:stretch>
+                      <a:fillRect/>
+                    </a:stretch>
+                  </pic:blipFill>
+                  <pic:spPr>
+                    <a:xfrm>
+                      <a:off x="0" y="0"/>
+                      <a:ext cx="6537849" cy="3049175"/>
+                    </a:xfrm>
+                    <a:prstGeom prst="rect">
+                      <a:avLst/>
+                    </a:prstGeom>
+                  </pic:spPr>
+                </pic:pic>
+              </a:graphicData>
+            </a:graphic>
+          </wp:inline>
+        </w:drawing>
+      </w:r>
     </w:p>
     <w:sectPr>
       <w:pgSz w:w="11906" w:h="16838"/>
@@ -4066,7 +4126,7 @@
   <w:abstractNum w:abstractNumId="12" w15:restartNumberingAfterBreak="0">
     <w:nsid w:val="6C9862C5"/>
     <w:multiLevelType w:val="hybridMultilevel"/>
-    <w:tmpl w:val="55DC69BE"/>
+    <w:tmpl w:val="075220BA"/>
     <w:lvl w:ilvl="0" w:tplc="40090001">
       <w:start w:val="1"/>
       <w:numFmt w:val="bullet"/>

</xml_diff>

<commit_message>
Commit after 3 weeks
</commit_message>
<xml_diff>
--- a/readme.docx
+++ b/readme.docx
@@ -220,22 +220,7 @@
         <w:ind w:left="360"/>
       </w:pPr>
       <w:r>
-        <w:rPr>
-          <w:highlight w:val="lightGray"/>
-        </w:rPr>
-        <w:t>D:\envs\</w:t>
-      </w:r>
-      <w:r>
-        <w:rPr>
-          <w:highlight w:val="yellow"/>
-        </w:rPr>
-        <w:t>projectenv</w:t>
-      </w:r>
-      <w:r>
-        <w:rPr>
-          <w:highlight w:val="lightGray"/>
-        </w:rPr>
-        <w:t>\Scripts\activate</w:t>
+        <w:t>D:\envs\projectenv\Scripts\activate</w:t>
       </w:r>
     </w:p>
     <w:p>
@@ -275,22 +260,56 @@
       </w:r>
     </w:p>
     <w:p>
-      <w:r>
+      <w:pPr>
+        <w:pStyle w:val="Heading1"/>
+        <w:numPr>
+          <w:ilvl w:val="0"/>
+          <w:numId w:val="7"/>
+        </w:numPr>
+        <w:spacing w:before="120" w:after="120"/>
+        <w:rPr>
+          <w:rFonts w:asciiTheme="minorHAnsi" w:hAnsiTheme="minorHAnsi" w:cstheme="minorHAnsi"/>
+          <w:b/>
+          <w:bCs/>
+          <w:sz w:val="32"/>
+          <w:szCs w:val="32"/>
+        </w:rPr>
+      </w:pPr>
+      <w:r>
+        <w:rPr>
+          <w:rFonts w:asciiTheme="minorHAnsi" w:hAnsiTheme="minorHAnsi" w:cstheme="minorHAnsi"/>
+          <w:b/>
+          <w:bCs/>
+          <w:sz w:val="32"/>
+          <w:szCs w:val="32"/>
+        </w:rPr>
         <w:t>To install packages in the environment:</w:t>
       </w:r>
       <w:r>
         <w:br/>
       </w:r>
       <w:r>
-        <w:br/>
+        <w:rPr>
+          <w:rFonts w:asciiTheme="minorHAnsi" w:eastAsiaTheme="minorHAnsi" w:hAnsiTheme="minorHAnsi" w:cstheme="minorBidi"/>
+          <w:color w:val="auto"/>
+          <w:sz w:val="24"/>
+          <w:szCs w:val="24"/>
+        </w:rPr>
         <w:t xml:space="preserve">1. </w:t>
       </w:r>
       <w:r>
+        <w:rPr>
+          <w:rFonts w:asciiTheme="minorHAnsi" w:eastAsiaTheme="minorHAnsi" w:hAnsiTheme="minorHAnsi" w:cstheme="minorBidi"/>
+          <w:color w:val="auto"/>
+          <w:sz w:val="24"/>
+          <w:szCs w:val="24"/>
+        </w:rPr>
         <w:t>With the "vaibhav" environment activated, use pip to install the required packages:</w:t>
       </w:r>
     </w:p>
     <w:p>
       <w:pPr>
+        <w:ind w:left="360"/>
         <w:rPr>
           <w:i/>
           <w:iCs/>
@@ -321,11 +340,17 @@
       </w:r>
     </w:p>
     <w:p>
+      <w:pPr>
+        <w:ind w:left="360"/>
+      </w:pPr>
       <w:r>
         <w:t xml:space="preserve">2. To confirm if they are installed: </w:t>
       </w:r>
     </w:p>
     <w:p>
+      <w:pPr>
+        <w:ind w:left="360"/>
+      </w:pPr>
       <w:r>
         <w:rPr>
           <w:i/>
@@ -807,7 +832,6 @@
         <w:t>, Git installed in local.</w:t>
       </w:r>
     </w:p>
-    <w:p/>
     <w:p>
       <w:pPr>
         <w:rPr>
@@ -961,7 +985,6 @@
         <w:ind w:left="360"/>
       </w:pPr>
       <w:r>
-        <w:lastRenderedPageBreak/>
         <w:t>If the values are shown correctly, Git has taken your username and email properly.</w:t>
       </w:r>
     </w:p>
@@ -980,6 +1003,7 @@
           <w:b/>
           <w:bCs/>
         </w:rPr>
+        <w:lastRenderedPageBreak/>
         <w:t>Check your remotes:</w:t>
       </w:r>
     </w:p>
@@ -2163,6 +2187,9 @@
         <w:spacing w:line="276" w:lineRule="auto"/>
       </w:pPr>
       <w:r>
+        <w:rPr>
+          <w:noProof/>
+        </w:rPr>
         <w:drawing>
           <wp:inline distT="0" distB="0" distL="0" distR="0" wp14:anchorId="7F0312CE" wp14:editId="33F5606C">
             <wp:extent cx="6271803" cy="3101609"/>
@@ -4064,6 +4091,119 @@
     </w:lvl>
   </w:abstractNum>
   <w:abstractNum w:abstractNumId="12" w15:restartNumberingAfterBreak="0">
+    <w:nsid w:val="6C3D1E81"/>
+    <w:multiLevelType w:val="hybridMultilevel"/>
+    <w:tmpl w:val="31562872"/>
+    <w:lvl w:ilvl="0" w:tplc="4009000B">
+      <w:start w:val="1"/>
+      <w:numFmt w:val="bullet"/>
+      <w:lvlText w:val=""/>
+      <w:lvlJc w:val="left"/>
+      <w:pPr>
+        <w:ind w:left="360" w:hanging="360"/>
+      </w:pPr>
+      <w:rPr>
+        <w:rFonts w:ascii="Wingdings" w:hAnsi="Wingdings" w:hint="default"/>
+      </w:rPr>
+    </w:lvl>
+    <w:lvl w:ilvl="1" w:tplc="40090003" w:tentative="1">
+      <w:start w:val="1"/>
+      <w:numFmt w:val="bullet"/>
+      <w:lvlText w:val="o"/>
+      <w:lvlJc w:val="left"/>
+      <w:pPr>
+        <w:ind w:left="1080" w:hanging="360"/>
+      </w:pPr>
+      <w:rPr>
+        <w:rFonts w:ascii="Courier New" w:hAnsi="Courier New" w:cs="Courier New" w:hint="default"/>
+      </w:rPr>
+    </w:lvl>
+    <w:lvl w:ilvl="2" w:tplc="40090005" w:tentative="1">
+      <w:start w:val="1"/>
+      <w:numFmt w:val="bullet"/>
+      <w:lvlText w:val=""/>
+      <w:lvlJc w:val="left"/>
+      <w:pPr>
+        <w:ind w:left="1800" w:hanging="360"/>
+      </w:pPr>
+      <w:rPr>
+        <w:rFonts w:ascii="Wingdings" w:hAnsi="Wingdings" w:hint="default"/>
+      </w:rPr>
+    </w:lvl>
+    <w:lvl w:ilvl="3" w:tplc="40090001" w:tentative="1">
+      <w:start w:val="1"/>
+      <w:numFmt w:val="bullet"/>
+      <w:lvlText w:val=""/>
+      <w:lvlJc w:val="left"/>
+      <w:pPr>
+        <w:ind w:left="2520" w:hanging="360"/>
+      </w:pPr>
+      <w:rPr>
+        <w:rFonts w:ascii="Symbol" w:hAnsi="Symbol" w:hint="default"/>
+      </w:rPr>
+    </w:lvl>
+    <w:lvl w:ilvl="4" w:tplc="40090003" w:tentative="1">
+      <w:start w:val="1"/>
+      <w:numFmt w:val="bullet"/>
+      <w:lvlText w:val="o"/>
+      <w:lvlJc w:val="left"/>
+      <w:pPr>
+        <w:ind w:left="3240" w:hanging="360"/>
+      </w:pPr>
+      <w:rPr>
+        <w:rFonts w:ascii="Courier New" w:hAnsi="Courier New" w:cs="Courier New" w:hint="default"/>
+      </w:rPr>
+    </w:lvl>
+    <w:lvl w:ilvl="5" w:tplc="40090005" w:tentative="1">
+      <w:start w:val="1"/>
+      <w:numFmt w:val="bullet"/>
+      <w:lvlText w:val=""/>
+      <w:lvlJc w:val="left"/>
+      <w:pPr>
+        <w:ind w:left="3960" w:hanging="360"/>
+      </w:pPr>
+      <w:rPr>
+        <w:rFonts w:ascii="Wingdings" w:hAnsi="Wingdings" w:hint="default"/>
+      </w:rPr>
+    </w:lvl>
+    <w:lvl w:ilvl="6" w:tplc="40090001" w:tentative="1">
+      <w:start w:val="1"/>
+      <w:numFmt w:val="bullet"/>
+      <w:lvlText w:val=""/>
+      <w:lvlJc w:val="left"/>
+      <w:pPr>
+        <w:ind w:left="4680" w:hanging="360"/>
+      </w:pPr>
+      <w:rPr>
+        <w:rFonts w:ascii="Symbol" w:hAnsi="Symbol" w:hint="default"/>
+      </w:rPr>
+    </w:lvl>
+    <w:lvl w:ilvl="7" w:tplc="40090003" w:tentative="1">
+      <w:start w:val="1"/>
+      <w:numFmt w:val="bullet"/>
+      <w:lvlText w:val="o"/>
+      <w:lvlJc w:val="left"/>
+      <w:pPr>
+        <w:ind w:left="5400" w:hanging="360"/>
+      </w:pPr>
+      <w:rPr>
+        <w:rFonts w:ascii="Courier New" w:hAnsi="Courier New" w:cs="Courier New" w:hint="default"/>
+      </w:rPr>
+    </w:lvl>
+    <w:lvl w:ilvl="8" w:tplc="40090005" w:tentative="1">
+      <w:start w:val="1"/>
+      <w:numFmt w:val="bullet"/>
+      <w:lvlText w:val=""/>
+      <w:lvlJc w:val="left"/>
+      <w:pPr>
+        <w:ind w:left="6120" w:hanging="360"/>
+      </w:pPr>
+      <w:rPr>
+        <w:rFonts w:ascii="Wingdings" w:hAnsi="Wingdings" w:hint="default"/>
+      </w:rPr>
+    </w:lvl>
+  </w:abstractNum>
+  <w:abstractNum w:abstractNumId="13" w15:restartNumberingAfterBreak="0">
     <w:nsid w:val="6C9862C5"/>
     <w:multiLevelType w:val="hybridMultilevel"/>
     <w:tmpl w:val="55DC69BE"/>
@@ -4176,7 +4316,7 @@
       </w:rPr>
     </w:lvl>
   </w:abstractNum>
-  <w:abstractNum w:abstractNumId="13" w15:restartNumberingAfterBreak="0">
+  <w:abstractNum w:abstractNumId="14" w15:restartNumberingAfterBreak="0">
     <w:nsid w:val="74DC65A0"/>
     <w:multiLevelType w:val="multilevel"/>
     <w:tmpl w:val="EFE27236"/>
@@ -4325,7 +4465,7 @@
       </w:rPr>
     </w:lvl>
   </w:abstractNum>
-  <w:abstractNum w:abstractNumId="14" w15:restartNumberingAfterBreak="0">
+  <w:abstractNum w:abstractNumId="15" w15:restartNumberingAfterBreak="0">
     <w:nsid w:val="7535507D"/>
     <w:multiLevelType w:val="multilevel"/>
     <w:tmpl w:val="FF10B904"/>
@@ -4481,10 +4621,10 @@
     <w:abstractNumId w:val="0"/>
   </w:num>
   <w:num w:numId="3" w16cid:durableId="957224679">
-    <w:abstractNumId w:val="14"/>
+    <w:abstractNumId w:val="15"/>
   </w:num>
   <w:num w:numId="4" w16cid:durableId="2059433098">
-    <w:abstractNumId w:val="13"/>
+    <w:abstractNumId w:val="14"/>
   </w:num>
   <w:num w:numId="5" w16cid:durableId="512651252">
     <w:abstractNumId w:val="4"/>
@@ -4514,10 +4654,13 @@
     <w:abstractNumId w:val="9"/>
   </w:num>
   <w:num w:numId="14" w16cid:durableId="932083569">
-    <w:abstractNumId w:val="12"/>
+    <w:abstractNumId w:val="13"/>
   </w:num>
   <w:num w:numId="15" w16cid:durableId="1741635326">
     <w:abstractNumId w:val="7"/>
+  </w:num>
+  <w:num w:numId="16" w16cid:durableId="2097357441">
+    <w:abstractNumId w:val="12"/>
   </w:num>
 </w:numbering>
 </file>
@@ -4951,7 +5094,6 @@
     <w:next w:val="Normal"/>
     <w:link w:val="Heading2Char"/>
     <w:uiPriority w:val="9"/>
-    <w:semiHidden/>
     <w:unhideWhenUsed/>
     <w:qFormat/>
     <w:rsid w:val="00F56C11"/>
@@ -5126,6 +5268,7 @@
   <w:style w:type="character" w:default="1" w:styleId="DefaultParagraphFont">
     <w:name w:val="Default Paragraph Font"/>
     <w:uiPriority w:val="1"/>
+    <w:semiHidden/>
     <w:unhideWhenUsed/>
   </w:style>
   <w:style w:type="table" w:default="1" w:styleId="TableNormal">
@@ -5167,7 +5310,6 @@
     <w:basedOn w:val="DefaultParagraphFont"/>
     <w:link w:val="Heading2"/>
     <w:uiPriority w:val="9"/>
-    <w:semiHidden/>
     <w:rsid w:val="00F56C11"/>
     <w:rPr>
       <w:rFonts w:asciiTheme="majorHAnsi" w:eastAsiaTheme="majorEastAsia" w:hAnsiTheme="majorHAnsi" w:cstheme="majorBidi"/>

</xml_diff>

<commit_message>
Updates after 3 weeks
</commit_message>
<xml_diff>
--- a/readme.docx
+++ b/readme.docx
@@ -1624,9 +1624,9 @@
           <w:noProof/>
         </w:rPr>
         <w:drawing>
-          <wp:inline distT="0" distB="0" distL="0" distR="0" wp14:anchorId="2CC8B39C" wp14:editId="1C10D27A">
-            <wp:extent cx="4905375" cy="2907323"/>
-            <wp:effectExtent l="0" t="0" r="0" b="7620"/>
+          <wp:inline distT="0" distB="0" distL="0" distR="0" wp14:anchorId="2CC8B39C" wp14:editId="078D93CD">
+            <wp:extent cx="4563745" cy="2552368"/>
+            <wp:effectExtent l="0" t="0" r="8255" b="635"/>
             <wp:docPr id="275131296" name="Picture 1"/>
             <wp:cNvGraphicFramePr>
               <a:graphicFrameLocks xmlns:a="http://schemas.openxmlformats.org/drawingml/2006/main" noChangeAspect="1"/>
@@ -1654,7 +1654,7 @@
                   <pic:spPr bwMode="auto">
                     <a:xfrm>
                       <a:off x="0" y="0"/>
-                      <a:ext cx="4907132" cy="2908364"/>
+                      <a:ext cx="4569725" cy="2555712"/>
                     </a:xfrm>
                     <a:prstGeom prst="rect">
                       <a:avLst/>
@@ -1690,8 +1690,8 @@
         </w:rPr>
         <w:lastRenderedPageBreak/>
         <w:drawing>
-          <wp:inline distT="0" distB="0" distL="0" distR="0" wp14:anchorId="77D94DCE" wp14:editId="59816365">
-            <wp:extent cx="4905375" cy="2750653"/>
+          <wp:inline distT="0" distB="0" distL="0" distR="0" wp14:anchorId="77D94DCE" wp14:editId="463FD747">
+            <wp:extent cx="4447540" cy="2553004"/>
             <wp:effectExtent l="0" t="0" r="0" b="0"/>
             <wp:docPr id="1521374749" name="Picture 1"/>
             <wp:cNvGraphicFramePr>
@@ -1720,7 +1720,7 @@
                   <pic:spPr bwMode="auto">
                     <a:xfrm>
                       <a:off x="0" y="0"/>
-                      <a:ext cx="4907132" cy="2751638"/>
+                      <a:ext cx="4454734" cy="2557133"/>
                     </a:xfrm>
                     <a:prstGeom prst="rect">
                       <a:avLst/>
@@ -1883,11 +1883,6 @@
           </wp:inline>
         </w:drawing>
       </w:r>
-    </w:p>
-    <w:p>
-      <w:pPr>
-        <w:spacing w:line="276" w:lineRule="auto"/>
-      </w:pPr>
     </w:p>
     <w:p>
       <w:pPr>
@@ -2378,11 +2373,25 @@
       </w:r>
       <w:proofErr w:type="spellStart"/>
       <w:r>
+        <w:rPr>
+          <w:b/>
+          <w:bCs/>
+        </w:rPr>
         <w:t>revision_questions</w:t>
       </w:r>
       <w:proofErr w:type="spellEnd"/>
       <w:r>
-        <w:t xml:space="preserve"> branch into the main branch in your online GitHub repository (https://github.com/vkabdwal/vscode_vk.git, referred to as online-</w:t>
+        <w:t xml:space="preserve"> branch into the </w:t>
+      </w:r>
+      <w:r>
+        <w:rPr>
+          <w:b/>
+          <w:bCs/>
+        </w:rPr>
+        <w:t>main</w:t>
+      </w:r>
+      <w:r>
+        <w:t xml:space="preserve"> branch in your online GitHub repository (https://github.com/vkabdwal/vscode_vk.git, referred to as online-</w:t>
       </w:r>
       <w:proofErr w:type="spellStart"/>
       <w:r>
@@ -2430,7 +2439,7 @@
       </w:r>
       <w:proofErr w:type="spellEnd"/>
       <w:r>
-        <w:t xml:space="preserve"> into main, or by performing the merge locally and pushing the updated main branch. Below is a precise, intuitive guide to accomplish this, tailored to your technical background, with steps for both methods.</w:t>
+        <w:t xml:space="preserve"> into main, or by performing the merge locally and pushing the updated main branch. </w:t>
       </w:r>
     </w:p>
     <w:p>
@@ -2477,8 +2486,75 @@
     </w:p>
     <w:p>
       <w:pPr>
+        <w:pStyle w:val="ListParagraph"/>
+        <w:numPr>
+          <w:ilvl w:val="0"/>
+          <w:numId w:val="14"/>
+        </w:numPr>
         <w:spacing w:line="276" w:lineRule="auto"/>
-      </w:pPr>
+        <w:rPr>
+          <w:b/>
+          <w:bCs/>
+        </w:rPr>
+      </w:pPr>
+      <w:r>
+        <w:rPr>
+          <w:b/>
+          <w:bCs/>
+        </w:rPr>
+        <w:t>Deleting a branch</w:t>
+      </w:r>
+    </w:p>
+    <w:p>
+      <w:pPr>
+        <w:pStyle w:val="ListParagraph"/>
+        <w:spacing w:line="276" w:lineRule="auto"/>
+        <w:ind w:left="360"/>
+      </w:pPr>
+      <w:r>
+        <w:lastRenderedPageBreak/>
+        <w:drawing>
+          <wp:inline distT="0" distB="0" distL="0" distR="0" wp14:anchorId="10ACA02E" wp14:editId="24620FE6">
+            <wp:extent cx="6313170" cy="4214191"/>
+            <wp:effectExtent l="0" t="0" r="0" b="0"/>
+            <wp:docPr id="2108645632" name="Picture 1"/>
+            <wp:cNvGraphicFramePr>
+              <a:graphicFrameLocks xmlns:a="http://schemas.openxmlformats.org/drawingml/2006/main" noChangeAspect="1"/>
+            </wp:cNvGraphicFramePr>
+            <a:graphic xmlns:a="http://schemas.openxmlformats.org/drawingml/2006/main">
+              <a:graphicData uri="http://schemas.openxmlformats.org/drawingml/2006/picture">
+                <pic:pic xmlns:pic="http://schemas.openxmlformats.org/drawingml/2006/picture">
+                  <pic:nvPicPr>
+                    <pic:cNvPr id="2108645632" name=""/>
+                    <pic:cNvPicPr/>
+                  </pic:nvPicPr>
+                  <pic:blipFill>
+                    <a:blip r:embed="rId16">
+                      <a:extLst>
+                        <a:ext uri="{28A0092B-C50C-407E-A947-70E740481C1C}">
+                          <a14:useLocalDpi xmlns:a14="http://schemas.microsoft.com/office/drawing/2010/main" val="0"/>
+                        </a:ext>
+                      </a:extLst>
+                    </a:blip>
+                    <a:stretch>
+                      <a:fillRect/>
+                    </a:stretch>
+                  </pic:blipFill>
+                  <pic:spPr>
+                    <a:xfrm>
+                      <a:off x="0" y="0"/>
+                      <a:ext cx="6316595" cy="4216477"/>
+                    </a:xfrm>
+                    <a:prstGeom prst="rect">
+                      <a:avLst/>
+                    </a:prstGeom>
+                  </pic:spPr>
+                </pic:pic>
+              </a:graphicData>
+            </a:graphic>
+          </wp:inline>
+        </w:drawing>
+      </w:r>
     </w:p>
     <w:sectPr>
       <w:pgSz w:w="11906" w:h="16838"/>
@@ -4206,7 +4282,7 @@
   <w:abstractNum w:abstractNumId="13" w15:restartNumberingAfterBreak="0">
     <w:nsid w:val="6C9862C5"/>
     <w:multiLevelType w:val="hybridMultilevel"/>
-    <w:tmpl w:val="55DC69BE"/>
+    <w:tmpl w:val="BFFEE9E8"/>
     <w:lvl w:ilvl="0" w:tplc="40090001">
       <w:start w:val="1"/>
       <w:numFmt w:val="bullet"/>

</xml_diff>